<commit_message>
feat: aktifkan tab Staf & Shift (data contoh, superadmin only)
- Store lokal stafStore + shiftStore (CRUD + toggle aktif, persist localStorage)
- Tab Staf: daftar, tambah/ubah/hapus, status aktif, reset ke contoh
- Tab Shift: jadwal, tambah/ubah/hapus, status aktif, reset ke contoh
- Khusus superadmin (CRUD_TABS), admin biasa tidak melihat kedua tab
</commit_message>
<xml_diff>
--- a/Dokumen_Proyek_LYCO1.docx
+++ b/Dokumen_Proyek_LYCO1.docx
@@ -496,10 +496,19 @@
                 <w:sz w:val="24"/>
                 <w:szCs w:val="24"/>
               </w:rPr>
-              <w:t xml:space="preserve"> mansyur</w:t>
-            </w:r>
-            <w:bookmarkStart w:id="0" w:name="_GoBack"/>
-            <w:bookmarkEnd w:id="0"/>
+              <w:t xml:space="preserve"> </w:t>
+            </w:r>
+            <w:proofErr w:type="spellStart"/>
+            <w:r>
+              <w:rPr>
+                <w:rFonts w:ascii="Times New Roman" w:hAnsi="Times New Roman" w:cs="Times New Roman"/>
+                <w:color w:val="0D0D0D" w:themeColor="text1" w:themeTint="F2"/>
+                <w:sz w:val="24"/>
+                <w:szCs w:val="24"/>
+              </w:rPr>
+              <w:t>mansyur</w:t>
+            </w:r>
+            <w:proofErr w:type="spellEnd"/>
           </w:p>
         </w:tc>
       </w:tr>
@@ -2329,6 +2338,7 @@
     <w:p>
       <w:pPr>
         <w:ind w:left="720"/>
+        <w:jc w:val="both"/>
         <w:rPr>
           <w:rFonts w:ascii="Times New Roman" w:hAnsi="Times New Roman" w:cs="Times New Roman"/>
           <w:color w:val="0D0D0D" w:themeColor="text1" w:themeTint="F2"/>
@@ -2624,16 +2634,7 @@
           <w:sz w:val="24"/>
           <w:szCs w:val="24"/>
         </w:rPr>
-        <w:t xml:space="preserve"> melalui web responsif; tidak dinyatakan sebagai aplikasi native. Dokumentasi dan use case saat ini hanya mendukung dua role, yaitu Pelanggan dan Admin. Role</w:t>
-      </w:r>
-      <w:r>
-        <w:rPr>
-          <w:rFonts w:ascii="Times New Roman" w:hAnsi="Times New Roman" w:cs="Times New Roman"/>
-          <w:color w:val="0D0D0D" w:themeColor="text1" w:themeTint="F2"/>
-          <w:sz w:val="24"/>
-          <w:szCs w:val="24"/>
-        </w:rPr>
-        <w:t xml:space="preserve"> ketiga tidak ditambahkan tanpa konfirmasi kebutuhan dan bukti dari sistem.</w:t>
+        <w:t xml:space="preserve"> melalui web responsif; tidak dinyatakan sebagai aplikasi native. Dokumentasi dan use case saat ini hanya mendukung dua role, yaitu Pelanggan dan Admin. Role ketiga tidak ditambahkan tanpa konfirmasi kebutuhan dan bukti dari sistem.</w:t>
       </w:r>
     </w:p>
     <w:p>
@@ -3806,16 +3807,7 @@
                 <w:sz w:val="24"/>
                 <w:szCs w:val="24"/>
               </w:rPr>
-              <w:t xml:space="preserve">Pelanggan perlu mengirim pesanan dengan </w:t>
-            </w:r>
-            <w:r>
-              <w:rPr>
-                <w:rFonts w:ascii="Times New Roman" w:hAnsi="Times New Roman" w:cs="Times New Roman"/>
-                <w:color w:val="0D0D0D" w:themeColor="text1" w:themeTint="F2"/>
-                <w:sz w:val="24"/>
-                <w:szCs w:val="24"/>
-              </w:rPr>
-              <w:t>nama, meja, dan catatan</w:t>
+              <w:t>Pelanggan perlu mengirim pesanan dengan nama, meja, dan catatan</w:t>
             </w:r>
           </w:p>
         </w:tc>
@@ -4205,16 +4197,7 @@
                 <w:sz w:val="24"/>
                 <w:szCs w:val="24"/>
               </w:rPr>
-              <w:t xml:space="preserve">Admin perlu </w:t>
-            </w:r>
-            <w:r>
-              <w:rPr>
-                <w:rFonts w:ascii="Times New Roman" w:hAnsi="Times New Roman" w:cs="Times New Roman"/>
-                <w:color w:val="0D0D0D" w:themeColor="text1" w:themeTint="F2"/>
-                <w:sz w:val="24"/>
-                <w:szCs w:val="24"/>
-              </w:rPr>
-              <w:t>menambah, mengubah, dan menghapus produk</w:t>
+              <w:t>Admin perlu menambah, mengubah, dan menghapus produk</w:t>
             </w:r>
           </w:p>
         </w:tc>
@@ -4605,16 +4588,7 @@
                 <w:sz w:val="24"/>
                 <w:szCs w:val="24"/>
               </w:rPr>
-              <w:t xml:space="preserve">Admin perlu </w:t>
-            </w:r>
-            <w:r>
-              <w:rPr>
-                <w:rFonts w:ascii="Times New Roman" w:hAnsi="Times New Roman" w:cs="Times New Roman"/>
-                <w:color w:val="0D0D0D" w:themeColor="text1" w:themeTint="F2"/>
-                <w:sz w:val="24"/>
-                <w:szCs w:val="24"/>
-              </w:rPr>
-              <w:t>mengatur kode dan status meja</w:t>
+              <w:t>Admin perlu mengatur kode dan status meja</w:t>
             </w:r>
           </w:p>
         </w:tc>
@@ -5004,16 +4978,7 @@
                 <w:sz w:val="24"/>
                 <w:szCs w:val="24"/>
               </w:rPr>
-              <w:t>Admin p</w:t>
-            </w:r>
-            <w:r>
-              <w:rPr>
-                <w:rFonts w:ascii="Times New Roman" w:hAnsi="Times New Roman" w:cs="Times New Roman"/>
-                <w:color w:val="0D0D0D" w:themeColor="text1" w:themeTint="F2"/>
-                <w:sz w:val="24"/>
-                <w:szCs w:val="24"/>
-              </w:rPr>
-              <w:t>erlu memantau ringkasan produk/kategori/pesanan</w:t>
+              <w:t>Admin perlu memantau ringkasan produk/kategori/pesanan</w:t>
             </w:r>
           </w:p>
         </w:tc>
@@ -5270,16 +5235,7 @@
                 <w:sz w:val="24"/>
                 <w:szCs w:val="24"/>
               </w:rPr>
-              <w:t xml:space="preserve">Pelanggan perlu mengenal layanan dan informasi </w:t>
-            </w:r>
-            <w:r>
-              <w:rPr>
-                <w:rFonts w:ascii="Times New Roman" w:hAnsi="Times New Roman" w:cs="Times New Roman"/>
-                <w:color w:val="0D0D0D" w:themeColor="text1" w:themeTint="F2"/>
-                <w:sz w:val="24"/>
-                <w:szCs w:val="24"/>
-              </w:rPr>
-              <w:t>kafe di layar kecil</w:t>
+              <w:t>Pelanggan perlu mengenal layanan dan informasi kafe di layar kecil</w:t>
             </w:r>
           </w:p>
         </w:tc>
@@ -5529,16 +5485,7 @@
                 <w:sz w:val="24"/>
                 <w:szCs w:val="24"/>
               </w:rPr>
-              <w:t xml:space="preserve">Pelanggan perlu menemukan menu tertentu melalui </w:t>
-            </w:r>
-            <w:r>
-              <w:rPr>
-                <w:rFonts w:ascii="Times New Roman" w:hAnsi="Times New Roman" w:cs="Times New Roman"/>
-                <w:color w:val="0D0D0D" w:themeColor="text1" w:themeTint="F2"/>
-                <w:sz w:val="24"/>
-                <w:szCs w:val="24"/>
-              </w:rPr>
-              <w:t>ponsel</w:t>
+              <w:t>Pelanggan perlu menemukan menu tertentu melalui ponsel</w:t>
             </w:r>
           </w:p>
         </w:tc>
@@ -5788,16 +5735,7 @@
                 <w:sz w:val="24"/>
                 <w:szCs w:val="24"/>
               </w:rPr>
-              <w:t>Pelanggan perlu mengetahui deskripsi dan harga mela</w:t>
-            </w:r>
-            <w:r>
-              <w:rPr>
-                <w:rFonts w:ascii="Times New Roman" w:hAnsi="Times New Roman" w:cs="Times New Roman"/>
-                <w:color w:val="0D0D0D" w:themeColor="text1" w:themeTint="F2"/>
-                <w:sz w:val="24"/>
-                <w:szCs w:val="24"/>
-              </w:rPr>
-              <w:t>lui ponsel</w:t>
+              <w:t>Pelanggan perlu mengetahui deskripsi dan harga melalui ponsel</w:t>
             </w:r>
           </w:p>
         </w:tc>
@@ -6298,16 +6236,7 @@
                 <w:sz w:val="24"/>
                 <w:szCs w:val="24"/>
               </w:rPr>
-              <w:t xml:space="preserve">Admin perlu mengakses area pengelolaan melalui </w:t>
-            </w:r>
-            <w:r>
-              <w:rPr>
-                <w:rFonts w:ascii="Times New Roman" w:hAnsi="Times New Roman" w:cs="Times New Roman"/>
-                <w:color w:val="0D0D0D" w:themeColor="text1" w:themeTint="F2"/>
-                <w:sz w:val="24"/>
-                <w:szCs w:val="24"/>
-              </w:rPr>
-              <w:t>layar kecil</w:t>
+              <w:t>Admin perlu mengakses area pengelolaan melalui layar kecil</w:t>
             </w:r>
           </w:p>
         </w:tc>
@@ -6557,16 +6486,7 @@
                 <w:sz w:val="24"/>
                 <w:szCs w:val="24"/>
               </w:rPr>
-              <w:t xml:space="preserve">Admin perlu meninjau pesanan dan statusnya melalui </w:t>
-            </w:r>
-            <w:r>
-              <w:rPr>
-                <w:rFonts w:ascii="Times New Roman" w:hAnsi="Times New Roman" w:cs="Times New Roman"/>
-                <w:color w:val="0D0D0D" w:themeColor="text1" w:themeTint="F2"/>
-                <w:sz w:val="24"/>
-                <w:szCs w:val="24"/>
-              </w:rPr>
-              <w:t>ponsel</w:t>
+              <w:t>Admin perlu meninjau pesanan dan statusnya melalui ponsel</w:t>
             </w:r>
           </w:p>
         </w:tc>
@@ -6835,6 +6755,7 @@
     <w:p>
       <w:pPr>
         <w:ind w:firstLine="720"/>
+        <w:jc w:val="both"/>
         <w:rPr>
           <w:rFonts w:ascii="Times New Roman" w:hAnsi="Times New Roman" w:cs="Times New Roman"/>
           <w:color w:val="0D0D0D" w:themeColor="text1" w:themeTint="F2"/>
@@ -7144,6 +7065,7 @@
     <w:p>
       <w:pPr>
         <w:ind w:firstLine="720"/>
+        <w:jc w:val="both"/>
         <w:rPr>
           <w:rFonts w:ascii="Times New Roman" w:hAnsi="Times New Roman" w:cs="Times New Roman"/>
           <w:color w:val="0D0D0D" w:themeColor="text1" w:themeTint="F2"/>
@@ -7422,6 +7344,7 @@
     <w:p>
       <w:pPr>
         <w:ind w:firstLine="720"/>
+        <w:jc w:val="both"/>
         <w:rPr>
           <w:rFonts w:ascii="Times New Roman" w:hAnsi="Times New Roman" w:cs="Times New Roman"/>
           <w:color w:val="0D0D0D" w:themeColor="text1" w:themeTint="F2"/>
@@ -7764,16 +7687,7 @@
           <w:sz w:val="24"/>
           <w:szCs w:val="24"/>
         </w:rPr>
-        <w:t>Tujuan User Story adalah menangkap kebutuhan dari sudut pa</w:t>
-      </w:r>
-      <w:r>
-        <w:rPr>
-          <w:rFonts w:ascii="Times New Roman" w:hAnsi="Times New Roman" w:cs="Times New Roman"/>
-          <w:color w:val="0D0D0D" w:themeColor="text1" w:themeTint="F2"/>
-          <w:sz w:val="24"/>
-          <w:szCs w:val="24"/>
-        </w:rPr>
-        <w:t xml:space="preserve">ndang pengguna. Gunakan format </w:t>
+        <w:t xml:space="preserve">Tujuan User Story adalah menangkap kebutuhan dari sudut pandang pengguna. Gunakan format </w:t>
       </w:r>
       <w:proofErr w:type="gramStart"/>
       <w:r>
@@ -7793,16 +7707,7 @@
           <w:sz w:val="24"/>
           <w:szCs w:val="24"/>
         </w:rPr>
-        <w:t>: “Sebagai [peran], saya ingin [kebutuhan] sehingga [manfaat]”. Setiap User Story dilengkapi prioritas, estimasi, dan kriteria diterima (acceptance criteria). Kriteria diterima harus berupa hasil yang dapat diamati penggu</w:t>
-      </w:r>
-      <w:r>
-        <w:rPr>
-          <w:rFonts w:ascii="Times New Roman" w:hAnsi="Times New Roman" w:cs="Times New Roman"/>
-          <w:color w:val="0D0D0D" w:themeColor="text1" w:themeTint="F2"/>
-          <w:sz w:val="24"/>
-          <w:szCs w:val="24"/>
-        </w:rPr>
-        <w:t xml:space="preserve">na, bukan langkah teknis implementasi. Jangan menyebut teknologi, halaman UI, frontend, backend, endpoint, database, atau </w:t>
+        <w:t xml:space="preserve">: “Sebagai [peran], saya ingin [kebutuhan] sehingga [manfaat]”. Setiap User Story dilengkapi prioritas, estimasi, dan kriteria diterima (acceptance criteria). Kriteria diterima harus berupa hasil yang dapat diamati pengguna, bukan langkah teknis implementasi. Jangan menyebut teknologi, halaman UI, frontend, backend, endpoint, database, atau </w:t>
       </w:r>
       <w:proofErr w:type="gramStart"/>
       <w:r>
@@ -8029,16 +7934,7 @@
                 <w:sz w:val="24"/>
                 <w:szCs w:val="24"/>
               </w:rPr>
-              <w:t xml:space="preserve">Sebagai Pelanggan, saya ingin </w:t>
-            </w:r>
-            <w:r>
-              <w:rPr>
-                <w:rFonts w:ascii="Times New Roman" w:hAnsi="Times New Roman" w:cs="Times New Roman"/>
-                <w:color w:val="0D0D0D" w:themeColor="text1" w:themeTint="F2"/>
-                <w:sz w:val="24"/>
-                <w:szCs w:val="24"/>
-              </w:rPr>
-              <w:t>melihat informasi utama LYCO sehingga memahami layanan kafe sebelum memesan.</w:t>
+              <w:t>Sebagai Pelanggan, saya ingin melihat informasi utama LYCO sehingga memahami layanan kafe sebelum memesan.</w:t>
             </w:r>
           </w:p>
         </w:tc>
@@ -8168,16 +8064,7 @@
                 <w:sz w:val="24"/>
                 <w:szCs w:val="24"/>
               </w:rPr>
-              <w:t>Sebagai Pelanggan, saya</w:t>
-            </w:r>
-            <w:r>
-              <w:rPr>
-                <w:rFonts w:ascii="Times New Roman" w:hAnsi="Times New Roman" w:cs="Times New Roman"/>
-                <w:color w:val="0D0D0D" w:themeColor="text1" w:themeTint="F2"/>
-                <w:sz w:val="24"/>
-                <w:szCs w:val="24"/>
-              </w:rPr>
-              <w:t xml:space="preserve"> ingin melihat daftar menu yang tersedia sehingga menentukan produk yang ingin dibeli.</w:t>
+              <w:t>Sebagai Pelanggan, saya ingin melihat daftar menu yang tersedia sehingga menentukan produk yang ingin dibeli.</w:t>
             </w:r>
           </w:p>
         </w:tc>
@@ -8307,16 +8194,7 @@
                 <w:sz w:val="24"/>
                 <w:szCs w:val="24"/>
               </w:rPr>
-              <w:t>Sebagai Pelangga</w:t>
-            </w:r>
-            <w:r>
-              <w:rPr>
-                <w:rFonts w:ascii="Times New Roman" w:hAnsi="Times New Roman" w:cs="Times New Roman"/>
-                <w:color w:val="0D0D0D" w:themeColor="text1" w:themeTint="F2"/>
-                <w:sz w:val="24"/>
-                <w:szCs w:val="24"/>
-              </w:rPr>
-              <w:t>n, saya ingin mencari produk berdasarkan nama sehingga menemukan menu tanpa menelusuri seluruh daftar.</w:t>
+              <w:t>Sebagai Pelanggan, saya ingin mencari produk berdasarkan nama sehingga menemukan menu tanpa menelusuri seluruh daftar.</w:t>
             </w:r>
           </w:p>
         </w:tc>
@@ -8391,16 +8269,7 @@
                 <w:sz w:val="24"/>
                 <w:szCs w:val="24"/>
               </w:rPr>
-              <w:t xml:space="preserve">Setelah nama produk dimasukkan, daftar menampilkan produk yang cocok; jika tidak ada kecocokan, pengguna mendapat informasi bahwa produk tidak </w:t>
-            </w:r>
-            <w:r>
-              <w:rPr>
-                <w:rFonts w:ascii="Times New Roman" w:hAnsi="Times New Roman" w:cs="Times New Roman"/>
-                <w:color w:val="0D0D0D" w:themeColor="text1" w:themeTint="F2"/>
-                <w:sz w:val="24"/>
-                <w:szCs w:val="24"/>
-              </w:rPr>
-              <w:t>ditemukan.</w:t>
+              <w:t>Setelah nama produk dimasukkan, daftar menampilkan produk yang cocok; jika tidak ada kecocokan, pengguna mendapat informasi bahwa produk tidak ditemukan.</w:t>
             </w:r>
           </w:p>
         </w:tc>
@@ -8561,16 +8430,7 @@
                 <w:sz w:val="24"/>
                 <w:szCs w:val="24"/>
               </w:rPr>
-              <w:t>US-</w:t>
-            </w:r>
-            <w:r>
-              <w:rPr>
-                <w:rFonts w:ascii="Times New Roman" w:hAnsi="Times New Roman" w:cs="Times New Roman"/>
-                <w:color w:val="0D0D0D" w:themeColor="text1" w:themeTint="F2"/>
-                <w:sz w:val="24"/>
-                <w:szCs w:val="24"/>
-              </w:rPr>
-              <w:t>05</w:t>
+              <w:t>US-05</w:t>
             </w:r>
           </w:p>
         </w:tc>
@@ -8725,16 +8585,7 @@
                 <w:sz w:val="24"/>
                 <w:szCs w:val="24"/>
               </w:rPr>
-              <w:t>Sebagai Pelanggan, saya ingi</w:t>
-            </w:r>
-            <w:r>
-              <w:rPr>
-                <w:rFonts w:ascii="Times New Roman" w:hAnsi="Times New Roman" w:cs="Times New Roman"/>
-                <w:color w:val="0D0D0D" w:themeColor="text1" w:themeTint="F2"/>
-                <w:sz w:val="24"/>
-                <w:szCs w:val="24"/>
-              </w:rPr>
-              <w:t>n membuka detail suatu produk sehingga memahami deskripsi dan harga sebelum memilih.</w:t>
+              <w:t>Sebagai Pelanggan, saya ingin membuka detail suatu produk sehingga memahami deskripsi dan harga sebelum memilih.</w:t>
             </w:r>
           </w:p>
         </w:tc>
@@ -8864,16 +8715,7 @@
                 <w:sz w:val="24"/>
                 <w:szCs w:val="24"/>
               </w:rPr>
-              <w:t>Sebagai Pelangg</w:t>
-            </w:r>
-            <w:r>
-              <w:rPr>
-                <w:rFonts w:ascii="Times New Roman" w:hAnsi="Times New Roman" w:cs="Times New Roman"/>
-                <w:color w:val="0D0D0D" w:themeColor="text1" w:themeTint="F2"/>
-                <w:sz w:val="24"/>
-                <w:szCs w:val="24"/>
-              </w:rPr>
-              <w:t>an, saya ingin menambahkan produk ke keranjang sehingga mengumpulkan pilihan dalam satu pesanan.</w:t>
+              <w:t>Sebagai Pelanggan, saya ingin menambahkan produk ke keranjang sehingga mengumpulkan pilihan dalam satu pesanan.</w:t>
             </w:r>
           </w:p>
         </w:tc>
@@ -9003,16 +8845,7 @@
                 <w:sz w:val="24"/>
                 <w:szCs w:val="24"/>
               </w:rPr>
-              <w:t xml:space="preserve">Sebagai Pelanggan, saya </w:t>
-            </w:r>
-            <w:r>
-              <w:rPr>
-                <w:rFonts w:ascii="Times New Roman" w:hAnsi="Times New Roman" w:cs="Times New Roman"/>
-                <w:color w:val="0D0D0D" w:themeColor="text1" w:themeTint="F2"/>
-                <w:sz w:val="24"/>
-                <w:szCs w:val="24"/>
-              </w:rPr>
-              <w:t xml:space="preserve">ingin menambah jumlah produk di keranjang </w:t>
+              <w:t xml:space="preserve">Sebagai Pelanggan, saya ingin menambah jumlah produk di keranjang </w:t>
             </w:r>
             <w:r>
               <w:rPr>
@@ -9164,16 +8997,7 @@
                 <w:sz w:val="24"/>
                 <w:szCs w:val="24"/>
               </w:rPr>
-              <w:t xml:space="preserve">Sebagai Pelanggan, saya ingin mengurangi jumlah </w:t>
-            </w:r>
-            <w:r>
-              <w:rPr>
-                <w:rFonts w:ascii="Times New Roman" w:hAnsi="Times New Roman" w:cs="Times New Roman"/>
-                <w:color w:val="0D0D0D" w:themeColor="text1" w:themeTint="F2"/>
-                <w:sz w:val="24"/>
-                <w:szCs w:val="24"/>
-              </w:rPr>
-              <w:t>produk di keranjang sehingga menyesuaikan pesanan sebelum dikirim.</w:t>
+              <w:t>Sebagai Pelanggan, saya ingin mengurangi jumlah produk di keranjang sehingga menyesuaikan pesanan sebelum dikirim.</w:t>
             </w:r>
           </w:p>
         </w:tc>
@@ -9303,16 +9127,7 @@
                 <w:sz w:val="24"/>
                 <w:szCs w:val="24"/>
               </w:rPr>
-              <w:t>Sebagai Pelanggan, saya ingin mengha</w:t>
-            </w:r>
-            <w:r>
-              <w:rPr>
-                <w:rFonts w:ascii="Times New Roman" w:hAnsi="Times New Roman" w:cs="Times New Roman"/>
-                <w:color w:val="0D0D0D" w:themeColor="text1" w:themeTint="F2"/>
-                <w:sz w:val="24"/>
-                <w:szCs w:val="24"/>
-              </w:rPr>
-              <w:t>pus produk dari keranjang sehingga membatalkan pilihan yang tidak jadi dibeli.</w:t>
+              <w:t>Sebagai Pelanggan, saya ingin menghapus produk dari keranjang sehingga membatalkan pilihan yang tidak jadi dibeli.</w:t>
             </w:r>
           </w:p>
         </w:tc>
@@ -9442,16 +9257,7 @@
                 <w:sz w:val="24"/>
                 <w:szCs w:val="24"/>
               </w:rPr>
-              <w:t xml:space="preserve">Sebagai Pelanggan, saya ingin melihat subtotal dan total </w:t>
-            </w:r>
-            <w:r>
-              <w:rPr>
-                <w:rFonts w:ascii="Times New Roman" w:hAnsi="Times New Roman" w:cs="Times New Roman"/>
-                <w:color w:val="0D0D0D" w:themeColor="text1" w:themeTint="F2"/>
-                <w:sz w:val="24"/>
-                <w:szCs w:val="24"/>
-              </w:rPr>
-              <w:t>keranjang sehingga mengetahui perkiraan biaya pesanan.</w:t>
+              <w:t>Sebagai Pelanggan, saya ingin melihat subtotal dan total keranjang sehingga mengetahui perkiraan biaya pesanan.</w:t>
             </w:r>
           </w:p>
         </w:tc>
@@ -9711,16 +9517,7 @@
                 <w:sz w:val="24"/>
                 <w:szCs w:val="24"/>
               </w:rPr>
-              <w:t>Sebag</w:t>
-            </w:r>
-            <w:r>
-              <w:rPr>
-                <w:rFonts w:ascii="Times New Roman" w:hAnsi="Times New Roman" w:cs="Times New Roman"/>
-                <w:color w:val="0D0D0D" w:themeColor="text1" w:themeTint="F2"/>
-                <w:sz w:val="24"/>
-                <w:szCs w:val="24"/>
-              </w:rPr>
-              <w:t xml:space="preserve">ai </w:t>
+              <w:t xml:space="preserve">Sebagai </w:t>
             </w:r>
             <w:r>
               <w:rPr>
@@ -10002,16 +9799,7 @@
                 <w:sz w:val="24"/>
                 <w:szCs w:val="24"/>
               </w:rPr>
-              <w:t>Sebagai Pelanggan, s</w:t>
-            </w:r>
-            <w:r>
-              <w:rPr>
-                <w:rFonts w:ascii="Times New Roman" w:hAnsi="Times New Roman" w:cs="Times New Roman"/>
-                <w:color w:val="0D0D0D" w:themeColor="text1" w:themeTint="F2"/>
-                <w:sz w:val="24"/>
-                <w:szCs w:val="24"/>
-              </w:rPr>
-              <w:t>aya ingin mengirim pesanan yang sudah diperiksa sehingga meneruskan pilihan saya sebagai pesanan.</w:t>
+              <w:t>Sebagai Pelanggan, saya ingin mengirim pesanan yang sudah diperiksa sehingga meneruskan pilihan saya sebagai pesanan.</w:t>
             </w:r>
           </w:p>
         </w:tc>
@@ -10271,16 +10059,7 @@
                 <w:sz w:val="24"/>
                 <w:szCs w:val="24"/>
               </w:rPr>
-              <w:t>Sebagai</w:t>
-            </w:r>
-            <w:r>
-              <w:rPr>
-                <w:rFonts w:ascii="Times New Roman" w:hAnsi="Times New Roman" w:cs="Times New Roman"/>
-                <w:color w:val="0D0D0D" w:themeColor="text1" w:themeTint="F2"/>
-                <w:sz w:val="24"/>
-                <w:szCs w:val="24"/>
-              </w:rPr>
-              <w:t xml:space="preserve"> Pelanggan, saya ingin melihat daftar pesanan pada sesi saya sehingga </w:t>
+              <w:t xml:space="preserve">Sebagai Pelanggan, saya ingin melihat daftar pesanan pada sesi saya sehingga </w:t>
             </w:r>
             <w:r>
               <w:rPr>
@@ -10432,16 +10211,7 @@
                 <w:sz w:val="24"/>
                 <w:szCs w:val="24"/>
               </w:rPr>
-              <w:t>Seba</w:t>
-            </w:r>
-            <w:r>
-              <w:rPr>
-                <w:rFonts w:ascii="Times New Roman" w:hAnsi="Times New Roman" w:cs="Times New Roman"/>
-                <w:color w:val="0D0D0D" w:themeColor="text1" w:themeTint="F2"/>
-                <w:sz w:val="24"/>
-                <w:szCs w:val="24"/>
-              </w:rPr>
-              <w:t>gai Pelanggan, saya ingin melihat status pesanan terkini sehingga mengetahui apakah pesanan baru atau diproses.</w:t>
+              <w:t>Sebagai Pelanggan, saya ingin melihat status pesanan terkini sehingga mengetahui apakah pesanan baru atau diproses.</w:t>
             </w:r>
           </w:p>
         </w:tc>
@@ -10536,16 +10306,7 @@
                 <w:sz w:val="24"/>
                 <w:szCs w:val="24"/>
               </w:rPr>
-              <w:t xml:space="preserve"> status yang dite</w:t>
-            </w:r>
-            <w:r>
-              <w:rPr>
-                <w:rFonts w:ascii="Times New Roman" w:hAnsi="Times New Roman" w:cs="Times New Roman"/>
-                <w:color w:val="0D0D0D" w:themeColor="text1" w:themeTint="F2"/>
-                <w:sz w:val="24"/>
-                <w:szCs w:val="24"/>
-              </w:rPr>
-              <w:t>tapkan kafe.</w:t>
+              <w:t xml:space="preserve"> status yang ditetapkan kafe.</w:t>
             </w:r>
           </w:p>
         </w:tc>
@@ -10675,16 +10436,7 @@
                 <w:sz w:val="24"/>
                 <w:szCs w:val="24"/>
               </w:rPr>
-              <w:t xml:space="preserve">Rincian pesanan menampilkan semua item, jumlah masing-masing, dan informasi terkait sesuai pesanan yang </w:t>
-            </w:r>
-            <w:r>
-              <w:rPr>
-                <w:rFonts w:ascii="Times New Roman" w:hAnsi="Times New Roman" w:cs="Times New Roman"/>
-                <w:color w:val="0D0D0D" w:themeColor="text1" w:themeTint="F2"/>
-                <w:sz w:val="24"/>
-                <w:szCs w:val="24"/>
-              </w:rPr>
-              <w:t>dipilih.</w:t>
+              <w:t>Rincian pesanan menampilkan semua item, jumlah masing-masing, dan informasi terkait sesuai pesanan yang dipilih.</w:t>
             </w:r>
           </w:p>
         </w:tc>
@@ -10869,16 +10621,7 @@
                 <w:sz w:val="24"/>
                 <w:szCs w:val="24"/>
               </w:rPr>
-              <w:t>Sebagai</w:t>
-            </w:r>
-            <w:r>
-              <w:rPr>
-                <w:rFonts w:ascii="Times New Roman" w:hAnsi="Times New Roman" w:cs="Times New Roman"/>
-                <w:color w:val="0D0D0D" w:themeColor="text1" w:themeTint="F2"/>
-                <w:sz w:val="24"/>
-                <w:szCs w:val="24"/>
-              </w:rPr>
-              <w:t xml:space="preserve"> Pelanggan, saya ingin menghapus item yang salah sebelum checkout sehingga menghindari pesanan yang tidak sesuai.</w:t>
+              <w:t>Sebagai Pelanggan, saya ingin menghapus item yang salah sebelum checkout sehingga menghindari pesanan yang tidak sesuai.</w:t>
             </w:r>
           </w:p>
         </w:tc>
@@ -10953,16 +10696,7 @@
                 <w:sz w:val="24"/>
                 <w:szCs w:val="24"/>
               </w:rPr>
-              <w:t>Sebelum checkout, pelanggan dapat menghapus item yang salah dan item tersebut tidak lagi tercantum dalam ringkasan serta total diperb</w:t>
-            </w:r>
-            <w:r>
-              <w:rPr>
-                <w:rFonts w:ascii="Times New Roman" w:hAnsi="Times New Roman" w:cs="Times New Roman"/>
-                <w:color w:val="0D0D0D" w:themeColor="text1" w:themeTint="F2"/>
-                <w:sz w:val="24"/>
-                <w:szCs w:val="24"/>
-              </w:rPr>
-              <w:t>arui.</w:t>
+              <w:t>Sebelum checkout, pelanggan dapat menghapus item yang salah dan item tersebut tidak lagi tercantum dalam ringkasan serta total diperbarui.</w:t>
             </w:r>
           </w:p>
         </w:tc>
@@ -11113,16 +10847,7 @@
                 <w:szCs w:val="24"/>
               </w:rPr>
               <w:lastRenderedPageBreak/>
-              <w:t>tetap terbaca dan dapat digunakan pada layar kecil tanpa informasi penting terp</w:t>
-            </w:r>
-            <w:r>
-              <w:rPr>
-                <w:rFonts w:ascii="Times New Roman" w:hAnsi="Times New Roman" w:cs="Times New Roman"/>
-                <w:color w:val="0D0D0D" w:themeColor="text1" w:themeTint="F2"/>
-                <w:sz w:val="24"/>
-                <w:szCs w:val="24"/>
-              </w:rPr>
-              <w:t>otong atau saling menutupi.</w:t>
+              <w:t>tetap terbaca dan dapat digunakan pada layar kecil tanpa informasi penting terpotong atau saling menutupi.</w:t>
             </w:r>
           </w:p>
         </w:tc>
@@ -11253,16 +10978,7 @@
                 <w:sz w:val="24"/>
                 <w:szCs w:val="24"/>
               </w:rPr>
-              <w:t xml:space="preserve">Gambar yang sesuai ditampilkan pada produk yang memiliki gambar; jika gambar tidak tersedia, tampilan tetap memberi </w:t>
-            </w:r>
-            <w:r>
-              <w:rPr>
-                <w:rFonts w:ascii="Times New Roman" w:hAnsi="Times New Roman" w:cs="Times New Roman"/>
-                <w:color w:val="0D0D0D" w:themeColor="text1" w:themeTint="F2"/>
-                <w:sz w:val="24"/>
-                <w:szCs w:val="24"/>
-              </w:rPr>
-              <w:t>penanda yang jelas tanpa mengganggu informasi produk.</w:t>
+              <w:t>Gambar yang sesuai ditampilkan pada produk yang memiliki gambar; jika gambar tidak tersedia, tampilan tetap memberi penanda yang jelas tanpa mengganggu informasi produk.</w:t>
             </w:r>
           </w:p>
         </w:tc>
@@ -11392,16 +11108,7 @@
                 <w:sz w:val="24"/>
                 <w:szCs w:val="24"/>
               </w:rPr>
-              <w:t>Dari detail produk, pelanggan dapat kembali ke daftar menu dan m</w:t>
-            </w:r>
-            <w:r>
-              <w:rPr>
-                <w:rFonts w:ascii="Times New Roman" w:hAnsi="Times New Roman" w:cs="Times New Roman"/>
-                <w:color w:val="0D0D0D" w:themeColor="text1" w:themeTint="F2"/>
-                <w:sz w:val="24"/>
-                <w:szCs w:val="24"/>
-              </w:rPr>
-              <w:t>elanjutkan penelusuran tanpa kehilangan akses ke katalog.</w:t>
+              <w:t>Dari detail produk, pelanggan dapat kembali ke daftar menu dan melanjutkan penelusuran tanpa kehilangan akses ke katalog.</w:t>
             </w:r>
           </w:p>
         </w:tc>
@@ -11531,16 +11238,7 @@
                 <w:sz w:val="24"/>
                 <w:szCs w:val="24"/>
               </w:rPr>
-              <w:t>Informasi tentang kafe dan kontak yang tersedia ditampilkan dengan j</w:t>
-            </w:r>
-            <w:r>
-              <w:rPr>
-                <w:rFonts w:ascii="Times New Roman" w:hAnsi="Times New Roman" w:cs="Times New Roman"/>
-                <w:color w:val="0D0D0D" w:themeColor="text1" w:themeTint="F2"/>
-                <w:sz w:val="24"/>
-                <w:szCs w:val="24"/>
-              </w:rPr>
-              <w:t>elas dan sesuai informasi yang ditetapkan.</w:t>
+              <w:t>Informasi tentang kafe dan kontak yang tersedia ditampilkan dengan jelas dan sesuai informasi yang ditetapkan.</w:t>
             </w:r>
           </w:p>
         </w:tc>
@@ -11681,16 +11379,7 @@
                 <w:sz w:val="24"/>
                 <w:szCs w:val="24"/>
               </w:rPr>
-              <w:t>Admin dengan kredensial yang benar dapat masuk dan melihat area pengelolaan; kredensial yang</w:t>
-            </w:r>
-            <w:r>
-              <w:rPr>
-                <w:rFonts w:ascii="Times New Roman" w:hAnsi="Times New Roman" w:cs="Times New Roman"/>
-                <w:color w:val="0D0D0D" w:themeColor="text1" w:themeTint="F2"/>
-                <w:sz w:val="24"/>
-                <w:szCs w:val="24"/>
-              </w:rPr>
-              <w:t xml:space="preserve"> </w:t>
+              <w:t xml:space="preserve">Admin dengan kredensial yang benar dapat masuk dan melihat area pengelolaan; kredensial yang </w:t>
             </w:r>
             <w:r>
               <w:rPr>
@@ -11831,16 +11520,7 @@
                 <w:sz w:val="24"/>
                 <w:szCs w:val="24"/>
               </w:rPr>
-              <w:t xml:space="preserve">Ringkasan dashboard menampilkan angka atau ringkasan data kafe yang tersedia dan </w:t>
-            </w:r>
-            <w:r>
-              <w:rPr>
-                <w:rFonts w:ascii="Times New Roman" w:hAnsi="Times New Roman" w:cs="Times New Roman"/>
-                <w:color w:val="0D0D0D" w:themeColor="text1" w:themeTint="F2"/>
-                <w:sz w:val="24"/>
-                <w:szCs w:val="24"/>
-              </w:rPr>
-              <w:t>nilainya sesuai data yang tercatat.</w:t>
+              <w:t>Ringkasan dashboard menampilkan angka atau ringkasan data kafe yang tersedia dan nilainya sesuai data yang tercatat.</w:t>
             </w:r>
           </w:p>
         </w:tc>
@@ -11970,16 +11650,7 @@
                 <w:sz w:val="24"/>
                 <w:szCs w:val="24"/>
               </w:rPr>
-              <w:t>Daftar produk menampilkan produk yang dikelola beserta informasi utama seperti nama, harga, kategori, dan ketersediaan j</w:t>
-            </w:r>
-            <w:r>
-              <w:rPr>
-                <w:rFonts w:ascii="Times New Roman" w:hAnsi="Times New Roman" w:cs="Times New Roman"/>
-                <w:color w:val="0D0D0D" w:themeColor="text1" w:themeTint="F2"/>
-                <w:sz w:val="24"/>
-                <w:szCs w:val="24"/>
-              </w:rPr>
-              <w:t>ika ada.</w:t>
+              <w:t>Daftar produk menampilkan produk yang dikelola beserta informasi utama seperti nama, harga, kategori, dan ketersediaan jika ada.</w:t>
             </w:r>
           </w:p>
         </w:tc>
@@ -12294,16 +11965,7 @@
                 <w:sz w:val="24"/>
                 <w:szCs w:val="24"/>
               </w:rPr>
-              <w:t>Sebagai</w:t>
-            </w:r>
-            <w:r>
-              <w:rPr>
-                <w:rFonts w:ascii="Times New Roman" w:hAnsi="Times New Roman" w:cs="Times New Roman"/>
-                <w:color w:val="0D0D0D" w:themeColor="text1" w:themeTint="F2"/>
-                <w:sz w:val="24"/>
-                <w:szCs w:val="24"/>
-              </w:rPr>
-              <w:t xml:space="preserve"> Admin, saya ingin </w:t>
+              <w:t xml:space="preserve">Sebagai Admin, saya ingin </w:t>
             </w:r>
             <w:r>
               <w:rPr>
@@ -12455,16 +12117,7 @@
                 <w:sz w:val="24"/>
                 <w:szCs w:val="24"/>
               </w:rPr>
-              <w:t xml:space="preserve">Sebagai </w:t>
-            </w:r>
-            <w:r>
-              <w:rPr>
-                <w:rFonts w:ascii="Times New Roman" w:hAnsi="Times New Roman" w:cs="Times New Roman"/>
-                <w:color w:val="0D0D0D" w:themeColor="text1" w:themeTint="F2"/>
-                <w:sz w:val="24"/>
-                <w:szCs w:val="24"/>
-              </w:rPr>
-              <w:t>Admin, saya ingin menandai produk sebagai unggulan sehingga menampilkan produk pilihan kepada pelanggan.</w:t>
+              <w:t>Sebagai Admin, saya ingin menandai produk sebagai unggulan sehingga menampilkan produk pilihan kepada pelanggan.</w:t>
             </w:r>
           </w:p>
         </w:tc>
@@ -12539,16 +12192,7 @@
                 <w:sz w:val="24"/>
                 <w:szCs w:val="24"/>
               </w:rPr>
-              <w:t>Ketika admin menandai produk sebagai unggulan, produk tersebut muncul pada bagian produk unggulan; jika tanda dihapus, produk tidak lagi ditampi</w:t>
-            </w:r>
-            <w:r>
-              <w:rPr>
-                <w:rFonts w:ascii="Times New Roman" w:hAnsi="Times New Roman" w:cs="Times New Roman"/>
-                <w:color w:val="0D0D0D" w:themeColor="text1" w:themeTint="F2"/>
-                <w:sz w:val="24"/>
-                <w:szCs w:val="24"/>
-              </w:rPr>
-              <w:t>lkan di bagian itu.</w:t>
+              <w:t>Ketika admin menandai produk sebagai unggulan, produk tersebut muncul pada bagian produk unggulan; jika tanda dihapus, produk tidak lagi ditampilkan di bagian itu.</w:t>
             </w:r>
           </w:p>
         </w:tc>
@@ -12678,16 +12322,7 @@
                 <w:sz w:val="24"/>
                 <w:szCs w:val="24"/>
               </w:rPr>
-              <w:t>Perubahan ketersediaan produk terlihat pada daftar menu; produk yang tidak ter</w:t>
-            </w:r>
-            <w:r>
-              <w:rPr>
-                <w:rFonts w:ascii="Times New Roman" w:hAnsi="Times New Roman" w:cs="Times New Roman"/>
-                <w:color w:val="0D0D0D" w:themeColor="text1" w:themeTint="F2"/>
-                <w:sz w:val="24"/>
-                <w:szCs w:val="24"/>
-              </w:rPr>
-              <w:t>sedia ditandai atau tidak dapat dipilih untuk pesanan baru.</w:t>
+              <w:t>Perubahan ketersediaan produk terlihat pada daftar menu; produk yang tidak tersedia ditandai atau tidak dapat dipilih untuk pesanan baru.</w:t>
             </w:r>
           </w:p>
         </w:tc>
@@ -12817,16 +12452,7 @@
                 <w:sz w:val="24"/>
                 <w:szCs w:val="24"/>
               </w:rPr>
-              <w:t>Daftar kategori menampilkan kategori yang digunakan untuk mengelompokkan menu dengan nama yang</w:t>
-            </w:r>
-            <w:r>
-              <w:rPr>
-                <w:rFonts w:ascii="Times New Roman" w:hAnsi="Times New Roman" w:cs="Times New Roman"/>
-                <w:color w:val="0D0D0D" w:themeColor="text1" w:themeTint="F2"/>
-                <w:sz w:val="24"/>
-                <w:szCs w:val="24"/>
-              </w:rPr>
-              <w:t xml:space="preserve"> dapat dibaca.</w:t>
+              <w:t>Daftar kategori menampilkan kategori yang digunakan untuk mengelompokkan menu dengan nama yang dapat dibaca.</w:t>
             </w:r>
           </w:p>
         </w:tc>
@@ -12977,16 +12603,7 @@
                 <w:szCs w:val="24"/>
               </w:rPr>
               <w:lastRenderedPageBreak/>
-              <w:t xml:space="preserve">digunakan untuk mengelompokkan </w:t>
-            </w:r>
-            <w:r>
-              <w:rPr>
-                <w:rFonts w:ascii="Times New Roman" w:hAnsi="Times New Roman" w:cs="Times New Roman"/>
-                <w:color w:val="0D0D0D" w:themeColor="text1" w:themeTint="F2"/>
-                <w:sz w:val="24"/>
-                <w:szCs w:val="24"/>
-              </w:rPr>
-              <w:t>produk.</w:t>
+              <w:t>digunakan untuk mengelompokkan produk.</w:t>
             </w:r>
           </w:p>
         </w:tc>
@@ -13172,16 +12789,7 @@
                 <w:sz w:val="24"/>
                 <w:szCs w:val="24"/>
               </w:rPr>
-              <w:t xml:space="preserve">Sebagai </w:t>
-            </w:r>
-            <w:r>
-              <w:rPr>
-                <w:rFonts w:ascii="Times New Roman" w:hAnsi="Times New Roman" w:cs="Times New Roman"/>
-                <w:color w:val="0D0D0D" w:themeColor="text1" w:themeTint="F2"/>
-                <w:sz w:val="24"/>
-                <w:szCs w:val="24"/>
-              </w:rPr>
-              <w:t>Admin, saya ingin mengatur urutan kategori sehingga menampilkan kelompok menu sesuai prioritas.</w:t>
+              <w:t>Sebagai Admin, saya ingin mengatur urutan kategori sehingga menampilkan kelompok menu sesuai prioritas.</w:t>
             </w:r>
           </w:p>
         </w:tc>
@@ -13311,16 +12919,7 @@
                 <w:sz w:val="24"/>
                 <w:szCs w:val="24"/>
               </w:rPr>
-              <w:t xml:space="preserve">Sebagai Admin, saya ingin menghapus kategori yang tidak </w:t>
-            </w:r>
-            <w:r>
-              <w:rPr>
-                <w:rFonts w:ascii="Times New Roman" w:hAnsi="Times New Roman" w:cs="Times New Roman"/>
-                <w:color w:val="0D0D0D" w:themeColor="text1" w:themeTint="F2"/>
-                <w:sz w:val="24"/>
-                <w:szCs w:val="24"/>
-              </w:rPr>
-              <w:t>digunakan sehingga menjaga kategori tetap rapi.</w:t>
+              <w:t>Sebagai Admin, saya ingin menghapus kategori yang tidak digunakan sehingga menjaga kategori tetap rapi.</w:t>
             </w:r>
           </w:p>
         </w:tc>
@@ -13450,16 +13049,7 @@
                 <w:sz w:val="24"/>
                 <w:szCs w:val="24"/>
               </w:rPr>
-              <w:t>Sebagai Admin</w:t>
-            </w:r>
-            <w:r>
-              <w:rPr>
-                <w:rFonts w:ascii="Times New Roman" w:hAnsi="Times New Roman" w:cs="Times New Roman"/>
-                <w:color w:val="0D0D0D" w:themeColor="text1" w:themeTint="F2"/>
-                <w:sz w:val="24"/>
-                <w:szCs w:val="24"/>
-              </w:rPr>
-              <w:t>, saya ingin melihat semua pesanan masuk sehingga memproses permintaan pelanggan.</w:t>
+              <w:t>Sebagai Admin, saya ingin melihat semua pesanan masuk sehingga memproses permintaan pelanggan.</w:t>
             </w:r>
           </w:p>
         </w:tc>
@@ -13589,16 +13179,7 @@
                 <w:sz w:val="24"/>
                 <w:szCs w:val="24"/>
               </w:rPr>
-              <w:t xml:space="preserve">Sebagai Admin, saya ingin memfilter </w:t>
-            </w:r>
-            <w:r>
-              <w:rPr>
-                <w:rFonts w:ascii="Times New Roman" w:hAnsi="Times New Roman" w:cs="Times New Roman"/>
-                <w:color w:val="0D0D0D" w:themeColor="text1" w:themeTint="F2"/>
-                <w:sz w:val="24"/>
-                <w:szCs w:val="24"/>
-              </w:rPr>
-              <w:t xml:space="preserve">daftar pesanan </w:t>
+              <w:t xml:space="preserve">Sebagai Admin, saya ingin memfilter daftar pesanan </w:t>
             </w:r>
             <w:r>
               <w:rPr>
@@ -13750,16 +13331,7 @@
                 <w:sz w:val="24"/>
                 <w:szCs w:val="24"/>
               </w:rPr>
-              <w:t>Sebagai Admin, saya ingin me</w:t>
-            </w:r>
-            <w:r>
-              <w:rPr>
-                <w:rFonts w:ascii="Times New Roman" w:hAnsi="Times New Roman" w:cs="Times New Roman"/>
-                <w:color w:val="0D0D0D" w:themeColor="text1" w:themeTint="F2"/>
-                <w:sz w:val="24"/>
-                <w:szCs w:val="24"/>
-              </w:rPr>
-              <w:t>mbuka rincian pesanan sehingga mengetahui item, meja, catatan, dan total.</w:t>
+              <w:t>Sebagai Admin, saya ingin membuka rincian pesanan sehingga mengetahui item, meja, catatan, dan total.</w:t>
             </w:r>
           </w:p>
         </w:tc>
@@ -13889,16 +13461,7 @@
                 <w:sz w:val="24"/>
                 <w:szCs w:val="24"/>
               </w:rPr>
-              <w:t>Sebagai Admin, saya ingin mengubah status pesanan sehingg</w:t>
-            </w:r>
-            <w:r>
-              <w:rPr>
-                <w:rFonts w:ascii="Times New Roman" w:hAnsi="Times New Roman" w:cs="Times New Roman"/>
-                <w:color w:val="0D0D0D" w:themeColor="text1" w:themeTint="F2"/>
-                <w:sz w:val="24"/>
-                <w:szCs w:val="24"/>
-              </w:rPr>
-              <w:t>a memberi informasi proses pesanan yang akurat.</w:t>
+              <w:t>Sebagai Admin, saya ingin mengubah status pesanan sehingga memberi informasi proses pesanan yang akurat.</w:t>
             </w:r>
           </w:p>
         </w:tc>
@@ -14028,16 +13591,7 @@
                 <w:sz w:val="24"/>
                 <w:szCs w:val="24"/>
               </w:rPr>
-              <w:t>Sebagai Admin, saya ingin meli</w:t>
-            </w:r>
-            <w:r>
-              <w:rPr>
-                <w:rFonts w:ascii="Times New Roman" w:hAnsi="Times New Roman" w:cs="Times New Roman"/>
-                <w:color w:val="0D0D0D" w:themeColor="text1" w:themeTint="F2"/>
-                <w:sz w:val="24"/>
-                <w:szCs w:val="24"/>
-              </w:rPr>
-              <w:t>hat daftar meja sehingga mengetahui meja yang tersedia pada sistem.</w:t>
+              <w:t>Sebagai Admin, saya ingin melihat daftar meja sehingga mengetahui meja yang tersedia pada sistem.</w:t>
             </w:r>
           </w:p>
         </w:tc>
@@ -14167,16 +13721,7 @@
                 <w:sz w:val="24"/>
                 <w:szCs w:val="24"/>
               </w:rPr>
-              <w:t xml:space="preserve">Sebagai Admin, saya ingin menambahkan atau mengubah kode meja sehingga menjaga data meja tetap </w:t>
-            </w:r>
-            <w:r>
-              <w:rPr>
-                <w:rFonts w:ascii="Times New Roman" w:hAnsi="Times New Roman" w:cs="Times New Roman"/>
-                <w:color w:val="0D0D0D" w:themeColor="text1" w:themeTint="F2"/>
-                <w:sz w:val="24"/>
-                <w:szCs w:val="24"/>
-              </w:rPr>
-              <w:t>sesuai kondisi kafe.</w:t>
+              <w:t>Sebagai Admin, saya ingin menambahkan atau mengubah kode meja sehingga menjaga data meja tetap sesuai kondisi kafe.</w:t>
             </w:r>
           </w:p>
         </w:tc>
@@ -14316,16 +13861,7 @@
                 <w:szCs w:val="24"/>
               </w:rPr>
               <w:lastRenderedPageBreak/>
-              <w:t>saya ingin menonaktifkan atau mengaktifkan meja sehingga mengendalikan meja</w:t>
-            </w:r>
-            <w:r>
-              <w:rPr>
-                <w:rFonts w:ascii="Times New Roman" w:hAnsi="Times New Roman" w:cs="Times New Roman"/>
-                <w:color w:val="0D0D0D" w:themeColor="text1" w:themeTint="F2"/>
-                <w:sz w:val="24"/>
-                <w:szCs w:val="24"/>
-              </w:rPr>
-              <w:t xml:space="preserve"> yang dapat dipilih.</w:t>
+              <w:t>saya ingin menonaktifkan atau mengaktifkan meja sehingga mengendalikan meja yang dapat dipilih.</w:t>
             </w:r>
           </w:p>
         </w:tc>
@@ -14467,16 +14003,7 @@
                 <w:sz w:val="24"/>
                 <w:szCs w:val="24"/>
               </w:rPr>
-              <w:t>Sebagai Admin, saya ingin memperbarui teks dan informasi kontak beranda sehingga men</w:t>
-            </w:r>
-            <w:r>
-              <w:rPr>
-                <w:rFonts w:ascii="Times New Roman" w:hAnsi="Times New Roman" w:cs="Times New Roman"/>
-                <w:color w:val="0D0D0D" w:themeColor="text1" w:themeTint="F2"/>
-                <w:sz w:val="24"/>
-                <w:szCs w:val="24"/>
-              </w:rPr>
-              <w:t>jaga informasi publik tetap akurat.</w:t>
+              <w:t>Sebagai Admin, saya ingin memperbarui teks dan informasi kontak beranda sehingga menjaga informasi publik tetap akurat.</w:t>
             </w:r>
           </w:p>
         </w:tc>
@@ -14606,16 +14133,7 @@
                 <w:sz w:val="24"/>
                 <w:szCs w:val="24"/>
               </w:rPr>
-              <w:t>Sebagai Admin, saya ingin mengatur pengaturan tampilan landing page sehingga menyesua</w:t>
-            </w:r>
-            <w:r>
-              <w:rPr>
-                <w:rFonts w:ascii="Times New Roman" w:hAnsi="Times New Roman" w:cs="Times New Roman"/>
-                <w:color w:val="0D0D0D" w:themeColor="text1" w:themeTint="F2"/>
-                <w:sz w:val="24"/>
-                <w:szCs w:val="24"/>
-              </w:rPr>
-              <w:t>ikan informasi yang dilihat pelanggan.</w:t>
+              <w:t>Sebagai Admin, saya ingin mengatur pengaturan tampilan landing page sehingga menyesuaikan informasi yang dilihat pelanggan.</w:t>
             </w:r>
           </w:p>
         </w:tc>
@@ -14745,16 +14263,7 @@
                 <w:sz w:val="24"/>
                 <w:szCs w:val="24"/>
               </w:rPr>
-              <w:t xml:space="preserve">Sebagai Admin, saya ingin mengunggah gambar produk dengan format yang didukung sehingga </w:t>
-            </w:r>
-            <w:r>
-              <w:rPr>
-                <w:rFonts w:ascii="Times New Roman" w:hAnsi="Times New Roman" w:cs="Times New Roman"/>
-                <w:color w:val="0D0D0D" w:themeColor="text1" w:themeTint="F2"/>
-                <w:sz w:val="24"/>
-                <w:szCs w:val="24"/>
-              </w:rPr>
-              <w:t>menampilkan visual produk yang sesuai.</w:t>
+              <w:t>Sebagai Admin, saya ingin mengunggah gambar produk dengan format yang didukung sehingga menampilkan visual produk yang sesuai.</w:t>
             </w:r>
           </w:p>
         </w:tc>
@@ -14884,16 +14393,7 @@
                 <w:sz w:val="24"/>
                 <w:szCs w:val="24"/>
               </w:rPr>
-              <w:t>Sebagai Admin</w:t>
-            </w:r>
-            <w:r>
-              <w:rPr>
-                <w:rFonts w:ascii="Times New Roman" w:hAnsi="Times New Roman" w:cs="Times New Roman"/>
-                <w:color w:val="0D0D0D" w:themeColor="text1" w:themeTint="F2"/>
-                <w:sz w:val="24"/>
-                <w:szCs w:val="24"/>
-              </w:rPr>
-              <w:t xml:space="preserve">, saya ingin menghapus gambar produk </w:t>
+              <w:t xml:space="preserve">Sebagai Admin, saya ingin menghapus gambar produk </w:t>
             </w:r>
             <w:r>
               <w:rPr>
@@ -15045,16 +14545,7 @@
                 <w:sz w:val="24"/>
                 <w:szCs w:val="24"/>
               </w:rPr>
-              <w:t>S</w:t>
-            </w:r>
-            <w:r>
-              <w:rPr>
-                <w:rFonts w:ascii="Times New Roman" w:hAnsi="Times New Roman" w:cs="Times New Roman"/>
-                <w:color w:val="0D0D0D" w:themeColor="text1" w:themeTint="F2"/>
-                <w:sz w:val="24"/>
-                <w:szCs w:val="24"/>
-              </w:rPr>
-              <w:t>ebagai Admin, saya ingin keluar dari portal admin sehingga mengakhiri sesi pengelolaan dengan aman.</w:t>
+              <w:t>Sebagai Admin, saya ingin keluar dari portal admin sehingga mengakhiri sesi pengelolaan dengan aman.</w:t>
             </w:r>
           </w:p>
         </w:tc>
@@ -15226,16 +14717,7 @@
           <w:sz w:val="24"/>
           <w:szCs w:val="24"/>
         </w:rPr>
-        <w:t>Gambar 3.1 — D</w:t>
-      </w:r>
-      <w:r>
-        <w:rPr>
-          <w:rFonts w:ascii="Times New Roman" w:hAnsi="Times New Roman" w:cs="Times New Roman"/>
-          <w:color w:val="0D0D0D" w:themeColor="text1" w:themeTint="F2"/>
-          <w:sz w:val="24"/>
-          <w:szCs w:val="24"/>
-        </w:rPr>
-        <w:t>iagram Use Case Pelanggan: Katalog dan Produk</w:t>
+        <w:t>Gambar 3.1 — Diagram Use Case Pelanggan: Katalog dan Produk</w:t>
       </w:r>
     </w:p>
     <w:p>
@@ -15328,6 +14810,7 @@
           <w:szCs w:val="24"/>
         </w:rPr>
       </w:pPr>
+      <w:bookmarkStart w:id="0" w:name="_GoBack"/>
       <w:r>
         <w:rPr>
           <w:rFonts w:ascii="Times New Roman" w:hAnsi="Times New Roman" w:cs="Times New Roman"/>
@@ -15372,6 +14855,7 @@
           </wp:inline>
         </w:drawing>
       </w:r>
+      <w:bookmarkEnd w:id="0"/>
     </w:p>
     <w:p>
       <w:pPr>
@@ -15468,25 +14952,7 @@
           <w:sz w:val="24"/>
           <w:szCs w:val="24"/>
         </w:rPr>
-        <w:t>Tiga diagram dikelompokkan berdasarkan tujuan aktor dan dipetakan ke User Story pada Ta</w:t>
-      </w:r>
-      <w:r>
-        <w:rPr>
-          <w:rFonts w:ascii="Times New Roman" w:hAnsi="Times New Roman" w:cs="Times New Roman"/>
-          <w:color w:val="0D0D0D" w:themeColor="text1" w:themeTint="F2"/>
-          <w:sz w:val="24"/>
-          <w:szCs w:val="24"/>
-        </w:rPr>
-        <w:t>bel 3.1 serta Lampiran A. Diagram 3.1 dan 3.2 memuat use case Pelanggan; Diagram 3.3 memuat use case Admin. Frontend, backend, API, dan database bukan aktor. Diagram pada dokumen ini merupakan rancangan visual; karena tugas mewajibkan StarUML, buka atau ga</w:t>
-      </w:r>
-      <w:r>
-        <w:rPr>
-          <w:rFonts w:ascii="Times New Roman" w:hAnsi="Times New Roman" w:cs="Times New Roman"/>
-          <w:color w:val="0D0D0D" w:themeColor="text1" w:themeTint="F2"/>
-          <w:sz w:val="24"/>
-          <w:szCs w:val="24"/>
-        </w:rPr>
-        <w:t>mbar ulang diagram tersebut di StarUML lalu ekspor dari aplikasi untuk memenuhi persyaratan alat.</w:t>
+        <w:t>Tiga diagram dikelompokkan berdasarkan tujuan aktor dan dipetakan ke User Story pada Tabel 3.1 serta Lampiran A. Diagram 3.1 dan 3.2 memuat use case Pelanggan; Diagram 3.3 memuat use case Admin. Frontend, backend, API, dan database bukan aktor. Diagram pada dokumen ini merupakan rancangan visual; karena tugas mewajibkan StarUML, buka atau gambar ulang diagram tersebut di StarUML lalu ekspor dari aplikasi untuk memenuhi persyaratan alat.</w:t>
       </w:r>
     </w:p>
     <w:p>
@@ -15719,16 +15185,7 @@
                 <w:sz w:val="24"/>
                 <w:szCs w:val="24"/>
               </w:rPr>
-              <w:t xml:space="preserve">UC-02 — Melihat Katalog </w:t>
-            </w:r>
-            <w:r>
-              <w:rPr>
-                <w:rFonts w:ascii="Times New Roman" w:hAnsi="Times New Roman" w:cs="Times New Roman"/>
-                <w:color w:val="0D0D0D" w:themeColor="text1" w:themeTint="F2"/>
-                <w:sz w:val="24"/>
-                <w:szCs w:val="24"/>
-              </w:rPr>
-              <w:t>Menu</w:t>
+              <w:t>UC-02 — Melihat Katalog Menu</w:t>
             </w:r>
           </w:p>
         </w:tc>
@@ -16559,16 +16016,7 @@
                 <w:szCs w:val="24"/>
               </w:rPr>
               <w:lastRenderedPageBreak/>
-              <w:t>UC-12 — Melihat Ringka</w:t>
-            </w:r>
-            <w:r>
-              <w:rPr>
-                <w:rFonts w:ascii="Times New Roman" w:hAnsi="Times New Roman" w:cs="Times New Roman"/>
-                <w:color w:val="0D0D0D" w:themeColor="text1" w:themeTint="F2"/>
-                <w:sz w:val="24"/>
-                <w:szCs w:val="24"/>
-              </w:rPr>
-              <w:t>san Biaya Keranjang</w:t>
+              <w:t>UC-12 — Melihat Ringkasan Biaya Keranjang</w:t>
             </w:r>
           </w:p>
         </w:tc>
@@ -19144,25 +18592,7 @@
           <w:sz w:val="24"/>
           <w:szCs w:val="24"/>
         </w:rPr>
-        <w:t>Activity Di</w:t>
-      </w:r>
-      <w:r>
-        <w:rPr>
-          <w:rFonts w:ascii="Times New Roman" w:hAnsi="Times New Roman" w:cs="Times New Roman"/>
-          <w:color w:val="0D0D0D" w:themeColor="text1" w:themeTint="F2"/>
-          <w:sz w:val="24"/>
-          <w:szCs w:val="24"/>
-        </w:rPr>
-        <w:t>agram menggambarkan alur kerja, keputusan, serta interaksi aktor dengan sistem. Lima diagram berikut dipilih dari alur yang memiliki percabangan dan dampak langsung terhadap kebutuhan pada User Story dan Use Case. Setiap diagram menggunakan swimlane, simbo</w:t>
-      </w:r>
-      <w:r>
-        <w:rPr>
-          <w:rFonts w:ascii="Times New Roman" w:hAnsi="Times New Roman" w:cs="Times New Roman"/>
-          <w:color w:val="0D0D0D" w:themeColor="text1" w:themeTint="F2"/>
-          <w:sz w:val="24"/>
-          <w:szCs w:val="24"/>
-        </w:rPr>
-        <w:t xml:space="preserve">l mulai/akhir, aktivitas, </w:t>
+        <w:t xml:space="preserve">Activity Diagram menggambarkan alur kerja, keputusan, serta interaksi aktor dengan sistem. Lima diagram berikut dipilih dari alur yang memiliki percabangan dan dampak langsung terhadap kebutuhan pada User Story dan Use Case. Setiap diagram menggunakan swimlane, simbol mulai/akhir, aktivitas, </w:t>
       </w:r>
       <w:proofErr w:type="gramStart"/>
       <w:r>
@@ -19301,16 +18731,7 @@
           <w:sz w:val="24"/>
           <w:szCs w:val="24"/>
         </w:rPr>
-        <w:t>Narasi alur 6.1: 1. Pelanggan membuka katalog dan memilih produk yang</w:t>
-      </w:r>
-      <w:r>
-        <w:rPr>
-          <w:rFonts w:ascii="Times New Roman" w:hAnsi="Times New Roman" w:cs="Times New Roman"/>
-          <w:color w:val="0D0D0D" w:themeColor="text1" w:themeTint="F2"/>
-          <w:sz w:val="24"/>
-          <w:szCs w:val="24"/>
-        </w:rPr>
-        <w:t xml:space="preserve"> diinginkan. 2. Pelanggan menambahkan produk ke keranjang. 3. Sistem memeriksa apakah keranjang berisi item; jika belum, pelanggan perlu memilih produk. 4. Pelanggan menyesuaikan jumlah atau menghapus item bila diperlukan. 5. Pelanggan mengisi </w:t>
+        <w:t xml:space="preserve">Narasi alur 6.1: 1. Pelanggan membuka katalog dan memilih produk yang diinginkan. 2. Pelanggan menambahkan produk ke keranjang. 3. Sistem memeriksa apakah keranjang berisi item; jika belum, pelanggan perlu memilih produk. 4. Pelanggan menyesuaikan jumlah atau menghapus item bila diperlukan. 5. Pelanggan mengisi </w:t>
       </w:r>
       <w:proofErr w:type="gramStart"/>
       <w:r>
@@ -19330,25 +18751,7 @@
           <w:sz w:val="24"/>
           <w:szCs w:val="24"/>
         </w:rPr>
-        <w:t xml:space="preserve"> pemesan</w:t>
-      </w:r>
-      <w:r>
-        <w:rPr>
-          <w:rFonts w:ascii="Times New Roman" w:hAnsi="Times New Roman" w:cs="Times New Roman"/>
-          <w:color w:val="0D0D0D" w:themeColor="text1" w:themeTint="F2"/>
-          <w:sz w:val="24"/>
-          <w:szCs w:val="24"/>
-        </w:rPr>
-        <w:t>, memilih meja, dan menambahkan catatan bila perlu. 6. Sistem memeriksa kelengkapan data pesanan. 7. Jika data belum valid, pelanggan memperbaikinya lalu mengirim kembali. 8. Jika valid, pelanggan mengirim pesanan. 9. Sistem menyimpan pesanan dan membuat k</w:t>
-      </w:r>
-      <w:r>
-        <w:rPr>
-          <w:rFonts w:ascii="Times New Roman" w:hAnsi="Times New Roman" w:cs="Times New Roman"/>
-          <w:color w:val="0D0D0D" w:themeColor="text1" w:themeTint="F2"/>
-          <w:sz w:val="24"/>
-          <w:szCs w:val="24"/>
-        </w:rPr>
-        <w:t>ode pesanan. 10. Pelanggan menerima kode konfirmasi. 11. Admin melihat pesanan baru pada daftar pesanan masuk. 12. Admin mulai memproses pesanan.</w:t>
+        <w:t xml:space="preserve"> pemesan, memilih meja, dan menambahkan catatan bila perlu. 6. Sistem memeriksa kelengkapan data pesanan. 7. Jika data belum valid, pelanggan memperbaikinya lalu mengirim kembali. 8. Jika valid, pelanggan mengirim pesanan. 9. Sistem menyimpan pesanan dan membuat kode pesanan. 10. Pelanggan menerima kode konfirmasi. 11. Admin melihat pesanan baru pada daftar pesanan masuk. 12. Admin mulai memproses pesanan.</w:t>
       </w:r>
     </w:p>
     <w:p>
@@ -19448,17 +18851,7 @@
           <w:sz w:val="24"/>
           <w:szCs w:val="24"/>
         </w:rPr>
-        <w:t xml:space="preserve">Tools: StarUML | File: docs/diagram/activity-2.png (draf gambar: </w:t>
-      </w:r>
-      <w:r>
-        <w:rPr>
-          <w:rFonts w:ascii="Times New Roman" w:hAnsi="Times New Roman" w:cs="Times New Roman"/>
-          <w:b w:val="0"/>
-          <w:color w:val="0D0D0D" w:themeColor="text1" w:themeTint="F2"/>
-          <w:sz w:val="24"/>
-          <w:szCs w:val="24"/>
-        </w:rPr>
-        <w:t>Activity_Diagram_2.png)</w:t>
+        <w:t>Tools: StarUML | File: docs/diagram/activity-2.png (draf gambar: Activity_Diagram_2.png)</w:t>
       </w:r>
     </w:p>
     <w:p>
@@ -19478,16 +18871,7 @@
           <w:sz w:val="24"/>
           <w:szCs w:val="24"/>
         </w:rPr>
-        <w:t>Narasi alur 6.2: 1. Admin membuka area pengelolaan dan memasukkan kredensial. 2. Sistem memeriksa kredensial admin. 3. Jika login gagal, sistem menampilkan informasi dan admin mencoba kembali. 4. Setelah berhasil, admin membuka daft</w:t>
-      </w:r>
-      <w:r>
-        <w:rPr>
-          <w:rFonts w:ascii="Times New Roman" w:hAnsi="Times New Roman" w:cs="Times New Roman"/>
-          <w:color w:val="0D0D0D" w:themeColor="text1" w:themeTint="F2"/>
-          <w:sz w:val="24"/>
-          <w:szCs w:val="24"/>
-        </w:rPr>
-        <w:t xml:space="preserve">ar produk. 5. Admin memilih tindakan tambah, ubah, atau hapus produk. 6. Untuk tambah, admin mengisi informasi produk; untuk ubah, admin memperbarui data produk yang dipilih; untuk hapus, admin memilih produk yang </w:t>
+        <w:t xml:space="preserve">Narasi alur 6.2: 1. Admin membuka area pengelolaan dan memasukkan kredensial. 2. Sistem memeriksa kredensial admin. 3. Jika login gagal, sistem menampilkan informasi dan admin mencoba kembali. 4. Setelah berhasil, admin membuka daftar produk. 5. Admin memilih tindakan tambah, ubah, atau hapus produk. 6. Untuk tambah, admin mengisi informasi produk; untuk ubah, admin memperbarui data produk yang dipilih; untuk hapus, admin memilih produk yang </w:t>
       </w:r>
       <w:proofErr w:type="gramStart"/>
       <w:r>
@@ -19507,25 +18891,7 @@
           <w:sz w:val="24"/>
           <w:szCs w:val="24"/>
         </w:rPr>
-        <w:t xml:space="preserve"> dihapus. 7. Sistem memeriksa kelengka</w:t>
-      </w:r>
-      <w:r>
-        <w:rPr>
-          <w:rFonts w:ascii="Times New Roman" w:hAnsi="Times New Roman" w:cs="Times New Roman"/>
-          <w:color w:val="0D0D0D" w:themeColor="text1" w:themeTint="F2"/>
-          <w:sz w:val="24"/>
-          <w:szCs w:val="24"/>
-        </w:rPr>
-        <w:t>pan data atau konfirmasi tindakan. 8. Jika data tidak valid atau tindakan tidak dapat dilakukan, sistem menampilkan pesan dan admin dapat memperbaiki pilihan. 9. Jika valid, sistem menyimpan perubahan. 10. Admin memeriksa daftar produk terbaru. 11. Alur be</w:t>
-      </w:r>
-      <w:r>
-        <w:rPr>
-          <w:rFonts w:ascii="Times New Roman" w:hAnsi="Times New Roman" w:cs="Times New Roman"/>
-          <w:color w:val="0D0D0D" w:themeColor="text1" w:themeTint="F2"/>
-          <w:sz w:val="24"/>
-          <w:szCs w:val="24"/>
-        </w:rPr>
-        <w:t>rakhir ketika hasil perubahan ditampilkan.</w:t>
+        <w:t xml:space="preserve"> dihapus. 7. Sistem memeriksa kelengkapan data atau konfirmasi tindakan. 8. Jika data tidak valid atau tindakan tidak dapat dilakukan, sistem menampilkan pesan dan admin dapat memperbaiki pilihan. 9. Jika valid, sistem menyimpan perubahan. 10. Admin memeriksa daftar produk terbaru. 11. Alur berakhir ketika hasil perubahan ditampilkan.</w:t>
       </w:r>
     </w:p>
     <w:p>
@@ -19644,16 +19010,7 @@
           <w:sz w:val="24"/>
           <w:szCs w:val="24"/>
         </w:rPr>
-        <w:t xml:space="preserve">Narasi alur 6.3: 1. Admin membuka daftar pesanan masuk. 2. Admin memilih </w:t>
-      </w:r>
-      <w:r>
-        <w:rPr>
-          <w:rFonts w:ascii="Times New Roman" w:hAnsi="Times New Roman" w:cs="Times New Roman"/>
-          <w:color w:val="0D0D0D" w:themeColor="text1" w:themeTint="F2"/>
-          <w:sz w:val="24"/>
-          <w:szCs w:val="24"/>
-        </w:rPr>
-        <w:t xml:space="preserve">filter status jika ingin mempersempit daftar. 3. Sistem menampilkan pesanan yang sesuai. 4. Admin memilih pesanan yang </w:t>
+        <w:t xml:space="preserve">Narasi alur 6.3: 1. Admin membuka daftar pesanan masuk. 2. Admin memilih filter status jika ingin mempersempit daftar. 3. Sistem menampilkan pesanan yang sesuai. 4. Admin memilih pesanan yang </w:t>
       </w:r>
       <w:proofErr w:type="gramStart"/>
       <w:r>
@@ -19673,25 +19030,7 @@
           <w:sz w:val="24"/>
           <w:szCs w:val="24"/>
         </w:rPr>
-        <w:t xml:space="preserve"> diperiksa. 5. Sistem memastikan pesanan tersedia; jika tidak ditemukan, sistem memberi informasi dan admin kembali ke daftar. 6. Jik</w:t>
-      </w:r>
-      <w:r>
-        <w:rPr>
-          <w:rFonts w:ascii="Times New Roman" w:hAnsi="Times New Roman" w:cs="Times New Roman"/>
-          <w:color w:val="0D0D0D" w:themeColor="text1" w:themeTint="F2"/>
-          <w:sz w:val="24"/>
-          <w:szCs w:val="24"/>
-        </w:rPr>
-        <w:t>a ditemukan, sistem menampilkan rincian pesanan. 7. Admin memilih status baru sesuai tahapan layanan. 8. Sistem memvalidasi perubahan status. 9. Jika perubahan tidak valid atau gagal, sistem menolak perubahan dan memberi informasi kepada admin. 10. Admin d</w:t>
-      </w:r>
-      <w:r>
-        <w:rPr>
-          <w:rFonts w:ascii="Times New Roman" w:hAnsi="Times New Roman" w:cs="Times New Roman"/>
-          <w:color w:val="0D0D0D" w:themeColor="text1" w:themeTint="F2"/>
-          <w:sz w:val="24"/>
-          <w:szCs w:val="24"/>
-        </w:rPr>
-        <w:t>apat memilih status lain. 11. Jika valid, sistem menyimpan status terbaru. 12. Pelanggan dapat melihat status pesanan yang telah diperbarui.</w:t>
+        <w:t xml:space="preserve"> diperiksa. 5. Sistem memastikan pesanan tersedia; jika tidak ditemukan, sistem memberi informasi dan admin kembali ke daftar. 6. Jika ditemukan, sistem menampilkan rincian pesanan. 7. Admin memilih status baru sesuai tahapan layanan. 8. Sistem memvalidasi perubahan status. 9. Jika perubahan tidak valid atau gagal, sistem menolak perubahan dan memberi informasi kepada admin. 10. Admin dapat memilih status lain. 11. Jika valid, sistem menyimpan status terbaru. 12. Pelanggan dapat melihat status pesanan yang telah diperbarui.</w:t>
       </w:r>
     </w:p>
     <w:p>
@@ -19791,17 +19130,7 @@
           <w:sz w:val="24"/>
           <w:szCs w:val="24"/>
         </w:rPr>
-        <w:t>Tools: StarUML | File: docs/diagram/activity-4.png (draf gambar: Activ</w:t>
-      </w:r>
-      <w:r>
-        <w:rPr>
-          <w:rFonts w:ascii="Times New Roman" w:hAnsi="Times New Roman" w:cs="Times New Roman"/>
-          <w:b w:val="0"/>
-          <w:color w:val="0D0D0D" w:themeColor="text1" w:themeTint="F2"/>
-          <w:sz w:val="24"/>
-          <w:szCs w:val="24"/>
-        </w:rPr>
-        <w:t>ity_Diagram_4.png)</w:t>
+        <w:t>Tools: StarUML | File: docs/diagram/activity-4.png (draf gambar: Activity_Diagram_4.png)</w:t>
       </w:r>
     </w:p>
     <w:p>
@@ -19860,16 +19189,7 @@
           <w:sz w:val="24"/>
           <w:szCs w:val="24"/>
         </w:rPr>
-        <w:t xml:space="preserve"> k</w:t>
-      </w:r>
-      <w:r>
-        <w:rPr>
-          <w:rFonts w:ascii="Times New Roman" w:hAnsi="Times New Roman" w:cs="Times New Roman"/>
-          <w:color w:val="0D0D0D" w:themeColor="text1" w:themeTint="F2"/>
-          <w:sz w:val="24"/>
-          <w:szCs w:val="24"/>
-        </w:rPr>
-        <w:t xml:space="preserve">ategori. 5. Untuk ubah, admin memilih kategori dan mengganti namanya. 6. Untuk pengurutan, admin menentukan posisi kategori. 7. Untuk penghapusan, admin memilih kategori yang </w:t>
+        <w:t xml:space="preserve"> kategori. 5. Untuk ubah, admin memilih kategori dan mengganti namanya. 6. Untuk pengurutan, admin menentukan posisi kategori. 7. Untuk penghapusan, admin memilih kategori yang </w:t>
       </w:r>
       <w:proofErr w:type="gramStart"/>
       <w:r>
@@ -19889,16 +19209,7 @@
           <w:sz w:val="24"/>
           <w:szCs w:val="24"/>
         </w:rPr>
-        <w:t xml:space="preserve"> dihapus. 8. Sistem memeriksa validitas data dan apakah kategori aman untuk d</w:t>
-      </w:r>
-      <w:r>
-        <w:rPr>
-          <w:rFonts w:ascii="Times New Roman" w:hAnsi="Times New Roman" w:cs="Times New Roman"/>
-          <w:color w:val="0D0D0D" w:themeColor="text1" w:themeTint="F2"/>
-          <w:sz w:val="24"/>
-          <w:szCs w:val="24"/>
-        </w:rPr>
-        <w:t xml:space="preserve">ihapus. 9. Jika </w:t>
+        <w:t xml:space="preserve"> dihapus. 8. Sistem memeriksa validitas data dan apakah kategori aman untuk dihapus. 9. Jika </w:t>
       </w:r>
       <w:proofErr w:type="gramStart"/>
       <w:r>
@@ -19918,16 +19229,7 @@
           <w:sz w:val="24"/>
           <w:szCs w:val="24"/>
         </w:rPr>
-        <w:t xml:space="preserve"> kosong/duplikat atau kategori masih digunakan, sistem menolak tindakan dan menjelaskan alasannya. 10. Admin memperbaiki data atau memilih tindakan lain. 11. Jika valid, sistem menyimpan perubahan. 12. Sistem menampilkan daftar kategori</w:t>
-      </w:r>
-      <w:r>
-        <w:rPr>
-          <w:rFonts w:ascii="Times New Roman" w:hAnsi="Times New Roman" w:cs="Times New Roman"/>
-          <w:color w:val="0D0D0D" w:themeColor="text1" w:themeTint="F2"/>
-          <w:sz w:val="24"/>
-          <w:szCs w:val="24"/>
-        </w:rPr>
-        <w:t xml:space="preserve"> terbaru.</w:t>
+        <w:t xml:space="preserve"> kosong/duplikat atau kategori masih digunakan, sistem menolak tindakan dan menjelaskan alasannya. 10. Admin memperbaiki data atau memilih tindakan lain. 11. Jika valid, sistem menyimpan perubahan. 12. Sistem menampilkan daftar kategori terbaru.</w:t>
       </w:r>
     </w:p>
     <w:p>
@@ -20066,16 +19368,7 @@
           <w:sz w:val="24"/>
           <w:szCs w:val="24"/>
         </w:rPr>
-        <w:t xml:space="preserve"> serta status setiap meja.</w:t>
-      </w:r>
-      <w:r>
-        <w:rPr>
-          <w:rFonts w:ascii="Times New Roman" w:hAnsi="Times New Roman" w:cs="Times New Roman"/>
-          <w:color w:val="0D0D0D" w:themeColor="text1" w:themeTint="F2"/>
-          <w:sz w:val="24"/>
-          <w:szCs w:val="24"/>
-        </w:rPr>
-        <w:t xml:space="preserve"> 3. Admin memilih tindakan menambah meja, mengubah kode/nama, atau mengaktifkan maupun menonaktifkan meja. 4. Sistem memeriksa apakah kode atau </w:t>
+        <w:t xml:space="preserve"> serta status setiap meja. 3. Admin memilih tindakan menambah meja, mengubah kode/nama, atau mengaktifkan maupun menonaktifkan meja. 4. Sistem memeriksa apakah kode atau </w:t>
       </w:r>
       <w:proofErr w:type="gramStart"/>
       <w:r>
@@ -20095,25 +19388,7 @@
           <w:sz w:val="24"/>
           <w:szCs w:val="24"/>
         </w:rPr>
-        <w:t xml:space="preserve"> meja valid dan tidak duplikat. 5. Jika data tidak valid, sistem menampilkan pesan dan admin memperbaiki dat</w:t>
-      </w:r>
-      <w:r>
-        <w:rPr>
-          <w:rFonts w:ascii="Times New Roman" w:hAnsi="Times New Roman" w:cs="Times New Roman"/>
-          <w:color w:val="0D0D0D" w:themeColor="text1" w:themeTint="F2"/>
-          <w:sz w:val="24"/>
-          <w:szCs w:val="24"/>
-        </w:rPr>
-        <w:t>a. 6. Jika valid, sistem menyimpan data meja atau status terbaru. 7. Sistem memperbarui daftar meja. 8. Pelanggan hanya melihat meja yang berstatus aktif saat memilih meja untuk pesanan. 9. Admin memeriksa hasil perubahan pada daftar. 10. Alur berakhir set</w:t>
-      </w:r>
-      <w:r>
-        <w:rPr>
-          <w:rFonts w:ascii="Times New Roman" w:hAnsi="Times New Roman" w:cs="Times New Roman"/>
-          <w:color w:val="0D0D0D" w:themeColor="text1" w:themeTint="F2"/>
-          <w:sz w:val="24"/>
-          <w:szCs w:val="24"/>
-        </w:rPr>
-        <w:t>elah hasil perubahan terlihat.</w:t>
+        <w:t xml:space="preserve"> meja valid dan tidak duplikat. 5. Jika data tidak valid, sistem menampilkan pesan dan admin memperbaiki data. 6. Jika valid, sistem menyimpan data meja atau status terbaru. 7. Sistem memperbarui daftar meja. 8. Pelanggan hanya melihat meja yang berstatus aktif saat memilih meja untuk pesanan. 9. Admin memeriksa hasil perubahan pada daftar. 10. Alur berakhir setelah hasil perubahan terlihat.</w:t>
       </w:r>
     </w:p>
     <w:p>
@@ -20201,7 +19476,7 @@
         <mc:AlternateContent>
           <mc:Choice Requires="wps">
             <w:drawing>
-              <wp:anchor distT="0" distB="0" distL="114300" distR="114300" simplePos="0" relativeHeight="251657216" behindDoc="0" locked="0" layoutInCell="1" allowOverlap="1" wp14:anchorId="55CDB479" wp14:editId="76C0F1BC">
+              <wp:anchor distT="0" distB="0" distL="114300" distR="114300" simplePos="0" relativeHeight="251658240" behindDoc="0" locked="0" layoutInCell="1" allowOverlap="1" wp14:anchorId="55CDB479" wp14:editId="76C0F1BC">
                 <wp:simplePos x="0" y="0"/>
                 <wp:positionH relativeFrom="column">
                   <wp:posOffset>789940</wp:posOffset>
@@ -20264,7 +19539,7 @@
           </mc:Choice>
           <mc:Fallback>
             <w:pict>
-              <v:rect w14:anchorId="4E50B230" id="Rectangle 1" o:spid="_x0000_s1026" style="position:absolute;margin-left:62.2pt;margin-top:239.5pt;width:350.8pt;height:17.3pt;z-index:251657216;visibility:visible;mso-wrap-style:square;mso-wrap-distance-left:9pt;mso-wrap-distance-top:0;mso-wrap-distance-right:9pt;mso-wrap-distance-bottom:0;mso-position-horizontal:absolute;mso-position-horizontal-relative:text;mso-position-vertical:absolute;mso-position-vertical-relative:text;v-text-anchor:middle" o:gfxdata="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" fillcolor="white [3212]" strokecolor="white [3212]"/>
+              <v:rect w14:anchorId="0B0783CC" id="Rectangle 1" o:spid="_x0000_s1026" style="position:absolute;margin-left:62.2pt;margin-top:239.5pt;width:350.8pt;height:17.3pt;z-index:251658240;visibility:visible;mso-wrap-style:square;mso-wrap-distance-left:9pt;mso-wrap-distance-top:0;mso-wrap-distance-right:9pt;mso-wrap-distance-bottom:0;mso-position-horizontal:absolute;mso-position-horizontal-relative:text;mso-position-vertical:absolute;mso-position-vertical-relative:text;v-text-anchor:middle" o:gfxdata="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" fillcolor="white [3212]" strokecolor="white [3212]"/>
             </w:pict>
           </mc:Fallback>
         </mc:AlternateContent>
@@ -20372,16 +19647,7 @@
           <w:sz w:val="24"/>
           <w:szCs w:val="24"/>
         </w:rPr>
-        <w:t>Product Backlog merangkum nilai yang ingin dicapai pengguna. Poin dan sprint merupakan r</w:t>
-      </w:r>
-      <w:r>
-        <w:rPr>
-          <w:rFonts w:ascii="Times New Roman" w:hAnsi="Times New Roman" w:cs="Times New Roman"/>
-          <w:color w:val="0D0D0D" w:themeColor="text1" w:themeTint="F2"/>
-          <w:sz w:val="24"/>
-          <w:szCs w:val="24"/>
-        </w:rPr>
-        <w:t xml:space="preserve">encana awal yang perlu dikonfirmasi </w:t>
+        <w:t xml:space="preserve">Product Backlog merangkum nilai yang ingin dicapai pengguna. Poin dan sprint merupakan rencana awal yang perlu dikonfirmasi </w:t>
       </w:r>
       <w:proofErr w:type="gramStart"/>
       <w:r>
@@ -20786,16 +20052,7 @@
                 <w:sz w:val="24"/>
                 <w:szCs w:val="24"/>
               </w:rPr>
-              <w:t xml:space="preserve">Pelanggan dapat mencari dan melihat </w:t>
-            </w:r>
-            <w:r>
-              <w:rPr>
-                <w:rFonts w:ascii="Times New Roman" w:hAnsi="Times New Roman" w:cs="Times New Roman"/>
-                <w:color w:val="0D0D0D" w:themeColor="text1" w:themeTint="F2"/>
-                <w:sz w:val="24"/>
-                <w:szCs w:val="24"/>
-              </w:rPr>
-              <w:t>detail produk</w:t>
+              <w:t>Pelanggan dapat mencari dan melihat detail produk</w:t>
             </w:r>
           </w:p>
         </w:tc>
@@ -21294,16 +20551,7 @@
                 <w:sz w:val="24"/>
                 <w:szCs w:val="24"/>
               </w:rPr>
-              <w:t xml:space="preserve">Admin dapat login dan logout dengan </w:t>
-            </w:r>
-            <w:r>
-              <w:rPr>
-                <w:rFonts w:ascii="Times New Roman" w:hAnsi="Times New Roman" w:cs="Times New Roman"/>
-                <w:color w:val="0D0D0D" w:themeColor="text1" w:themeTint="F2"/>
-                <w:sz w:val="24"/>
-                <w:szCs w:val="24"/>
-              </w:rPr>
-              <w:t>aman</w:t>
+              <w:t>Admin dapat login dan logout dengan aman</w:t>
             </w:r>
           </w:p>
         </w:tc>
@@ -21913,16 +21161,7 @@
                 <w:sz w:val="24"/>
                 <w:szCs w:val="24"/>
               </w:rPr>
-              <w:t xml:space="preserve">Admin </w:t>
-            </w:r>
-            <w:r>
-              <w:rPr>
-                <w:rFonts w:ascii="Times New Roman" w:hAnsi="Times New Roman" w:cs="Times New Roman"/>
-                <w:color w:val="0D0D0D" w:themeColor="text1" w:themeTint="F2"/>
-                <w:sz w:val="24"/>
-                <w:szCs w:val="24"/>
-              </w:rPr>
-              <w:t>dapat mengubah konten dan pengaturan landing page</w:t>
+              <w:t>Admin dapat mengubah konten dan pengaturan landing page</w:t>
             </w:r>
           </w:p>
         </w:tc>
@@ -22222,16 +21461,7 @@
           <w:sz w:val="24"/>
           <w:szCs w:val="24"/>
         </w:rPr>
-        <w:t xml:space="preserve">Sprint 1 — Goal: menyediakan alur dasar pelanggan untuk </w:t>
-      </w:r>
-      <w:r>
-        <w:rPr>
-          <w:rFonts w:ascii="Times New Roman" w:hAnsi="Times New Roman" w:cs="Times New Roman"/>
-          <w:color w:val="0D0D0D" w:themeColor="text1" w:themeTint="F2"/>
-          <w:sz w:val="24"/>
-          <w:szCs w:val="24"/>
-        </w:rPr>
-        <w:t>menelusuri menu, mengelola keranjang, membuat pesanan, dan melihat statusnya. Periode: isi sesuai tanggal aktual. Velocity rencana: 34 pts berdasarkan jumlah points PBI Sprint 1 pada backlog awal.</w:t>
+        <w:t>Sprint 1 — Goal: menyediakan alur dasar pelanggan untuk menelusuri menu, mengelola keranjang, membuat pesanan, dan melihat statusnya. Periode: isi sesuai tanggal aktual. Velocity rencana: 34 pts berdasarkan jumlah points PBI Sprint 1 pada backlog awal.</w:t>
       </w:r>
     </w:p>
     <w:tbl>
@@ -23760,16 +22990,7 @@
                 <w:sz w:val="24"/>
                 <w:szCs w:val="24"/>
               </w:rPr>
-              <w:t xml:space="preserve">Menguji </w:t>
-            </w:r>
-            <w:r>
-              <w:rPr>
-                <w:rFonts w:ascii="Times New Roman" w:hAnsi="Times New Roman" w:cs="Times New Roman"/>
-                <w:color w:val="0D0D0D" w:themeColor="text1" w:themeTint="F2"/>
-                <w:sz w:val="24"/>
-                <w:szCs w:val="24"/>
-              </w:rPr>
-              <w:t>kode meja duplikat dan meja dengan pesanan aktif</w:t>
+              <w:t>Menguji kode meja duplikat dan meja dengan pesanan aktif</w:t>
             </w:r>
           </w:p>
         </w:tc>
@@ -24776,16 +23997,7 @@
           <w:sz w:val="24"/>
           <w:szCs w:val="24"/>
         </w:rPr>
-        <w:t>Berdasarkan penelusuran project LYCO, aktor eksternal yang digunakan adalah Pelanggan dan Admin. Use case menggambarkan tujuan dan interaksi yang terlihat oleh aktor, bukan komponen atau pekerjaan teknis. Use ca</w:t>
-      </w:r>
-      <w:r>
-        <w:rPr>
-          <w:rFonts w:ascii="Times New Roman" w:hAnsi="Times New Roman" w:cs="Times New Roman"/>
-          <w:color w:val="0D0D0D" w:themeColor="text1" w:themeTint="F2"/>
-          <w:sz w:val="24"/>
-          <w:szCs w:val="24"/>
-        </w:rPr>
-        <w:t xml:space="preserve">se pencarian dan filter merupakan </w:t>
+        <w:t xml:space="preserve">Berdasarkan penelusuran project LYCO, aktor eksternal yang digunakan adalah Pelanggan dan Admin. Use case menggambarkan tujuan dan interaksi yang terlihat oleh aktor, bukan komponen atau pekerjaan teknis. Use case pencarian dan filter merupakan </w:t>
       </w:r>
       <w:proofErr w:type="gramStart"/>
       <w:r>
@@ -24863,16 +24075,7 @@
           <w:sz w:val="24"/>
           <w:szCs w:val="24"/>
         </w:rPr>
-        <w:t>Tujuan: Mengetahui informasi uta</w:t>
-      </w:r>
-      <w:r>
-        <w:rPr>
-          <w:rFonts w:ascii="Times New Roman" w:hAnsi="Times New Roman" w:cs="Times New Roman"/>
-          <w:color w:val="0D0D0D" w:themeColor="text1" w:themeTint="F2"/>
-          <w:sz w:val="24"/>
-          <w:szCs w:val="24"/>
-        </w:rPr>
-        <w:t>ma LYCO sebelum memesan.</w:t>
+        <w:t>Tujuan: Mengetahui informasi utama LYCO sebelum memesan.</w:t>
       </w:r>
     </w:p>
     <w:p>
@@ -24949,16 +24152,7 @@
           <w:sz w:val="24"/>
           <w:szCs w:val="24"/>
         </w:rPr>
-        <w:t>Alur alternatif: Jika sebagian informasi belum tersedia, sistem</w:t>
-      </w:r>
-      <w:r>
-        <w:rPr>
-          <w:rFonts w:ascii="Times New Roman" w:hAnsi="Times New Roman" w:cs="Times New Roman"/>
-          <w:color w:val="0D0D0D" w:themeColor="text1" w:themeTint="F2"/>
-          <w:sz w:val="24"/>
-          <w:szCs w:val="24"/>
-        </w:rPr>
-        <w:t xml:space="preserve"> menampilkan informasi yang ada tanpa membuat informasi palsu.</w:t>
+        <w:t>Alur alternatif: Jika sebagian informasi belum tersedia, sistem menampilkan informasi yang ada tanpa membuat informasi palsu.</w:t>
       </w:r>
     </w:p>
     <w:p>
@@ -25054,16 +24248,7 @@
           <w:sz w:val="24"/>
           <w:szCs w:val="24"/>
         </w:rPr>
-        <w:t>Prasyarat: Katalo</w:t>
-      </w:r>
-      <w:r>
-        <w:rPr>
-          <w:rFonts w:ascii="Times New Roman" w:hAnsi="Times New Roman" w:cs="Times New Roman"/>
-          <w:color w:val="0D0D0D" w:themeColor="text1" w:themeTint="F2"/>
-          <w:sz w:val="24"/>
-          <w:szCs w:val="24"/>
-        </w:rPr>
-        <w:t>g menu dapat diakses.</w:t>
+        <w:t>Prasyarat: Katalog menu dapat diakses.</w:t>
       </w:r>
     </w:p>
     <w:p>
@@ -25121,16 +24306,7 @@
           <w:sz w:val="24"/>
           <w:szCs w:val="24"/>
         </w:rPr>
-        <w:t>Alur alternatif: Jika belum ada produk tersedia, sistem menampilkan informasi bahwa menu belum tersedi</w:t>
-      </w:r>
-      <w:r>
-        <w:rPr>
-          <w:rFonts w:ascii="Times New Roman" w:hAnsi="Times New Roman" w:cs="Times New Roman"/>
-          <w:color w:val="0D0D0D" w:themeColor="text1" w:themeTint="F2"/>
-          <w:sz w:val="24"/>
-          <w:szCs w:val="24"/>
-        </w:rPr>
-        <w:t>a.</w:t>
+        <w:t>Alur alternatif: Jika belum ada produk tersedia, sistem menampilkan informasi bahwa menu belum tersedia.</w:t>
       </w:r>
     </w:p>
     <w:p>
@@ -25265,16 +24441,7 @@
           <w:sz w:val="24"/>
           <w:szCs w:val="24"/>
         </w:rPr>
-        <w:t xml:space="preserve">Alur utama: Pelanggan memasukkan kata kunci; </w:t>
-      </w:r>
-      <w:r>
-        <w:rPr>
-          <w:rFonts w:ascii="Times New Roman" w:hAnsi="Times New Roman" w:cs="Times New Roman"/>
-          <w:color w:val="0D0D0D" w:themeColor="text1" w:themeTint="F2"/>
-          <w:sz w:val="24"/>
-          <w:szCs w:val="24"/>
-        </w:rPr>
-        <w:t>sistem menampilkan produk yang cocok dengan kata kunci tersebut.</w:t>
+        <w:t>Alur utama: Pelanggan memasukkan kata kunci; sistem menampilkan produk yang cocok dengan kata kunci tersebut.</w:t>
       </w:r>
     </w:p>
     <w:p>
@@ -25312,16 +24479,7 @@
           <w:sz w:val="24"/>
           <w:szCs w:val="24"/>
         </w:rPr>
-        <w:t>Hasil: Pelanggan menemukan produk yang dicari atau mengeta</w:t>
-      </w:r>
-      <w:r>
-        <w:rPr>
-          <w:rFonts w:ascii="Times New Roman" w:hAnsi="Times New Roman" w:cs="Times New Roman"/>
-          <w:color w:val="0D0D0D" w:themeColor="text1" w:themeTint="F2"/>
-          <w:sz w:val="24"/>
-          <w:szCs w:val="24"/>
-        </w:rPr>
-        <w:t>hui tidak ada hasil.</w:t>
+        <w:t>Hasil: Pelanggan menemukan produk yang dicari atau mengetahui tidak ada hasil.</w:t>
       </w:r>
     </w:p>
     <w:p>
@@ -25418,16 +24576,7 @@
           <w:sz w:val="24"/>
           <w:szCs w:val="24"/>
         </w:rPr>
-        <w:t>Alur utama: Pelanggan memilih kategori; sistem menampilkan prod</w:t>
-      </w:r>
-      <w:r>
-        <w:rPr>
-          <w:rFonts w:ascii="Times New Roman" w:hAnsi="Times New Roman" w:cs="Times New Roman"/>
-          <w:color w:val="0D0D0D" w:themeColor="text1" w:themeTint="F2"/>
-          <w:sz w:val="24"/>
-          <w:szCs w:val="24"/>
-        </w:rPr>
-        <w:t>uk dalam kategori tersebut; pelanggan dapat kembali ke seluruh menu.</w:t>
+        <w:t>Alur utama: Pelanggan memilih kategori; sistem menampilkan produk dalam kategori tersebut; pelanggan dapat kembali ke seluruh menu.</w:t>
       </w:r>
     </w:p>
     <w:p>
@@ -25504,16 +24653,7 @@
           <w:sz w:val="24"/>
           <w:szCs w:val="24"/>
         </w:rPr>
-        <w:t>Aktor: Pel</w:t>
-      </w:r>
-      <w:r>
-        <w:rPr>
-          <w:rFonts w:ascii="Times New Roman" w:hAnsi="Times New Roman" w:cs="Times New Roman"/>
-          <w:color w:val="0D0D0D" w:themeColor="text1" w:themeTint="F2"/>
-          <w:sz w:val="24"/>
-          <w:szCs w:val="24"/>
-        </w:rPr>
-        <w:t>anggan. User Story terkait: US-05.</w:t>
+        <w:t>Aktor: Pelanggan. User Story terkait: US-05.</w:t>
       </w:r>
     </w:p>
     <w:p>
@@ -25570,16 +24710,7 @@
           <w:sz w:val="24"/>
           <w:szCs w:val="24"/>
         </w:rPr>
-        <w:t xml:space="preserve">Alur utama: Pelanggan membuka bagian menu unggulan; sistem menampilkan produk yang ditandai sebagai unggulan beserta </w:t>
-      </w:r>
-      <w:r>
-        <w:rPr>
-          <w:rFonts w:ascii="Times New Roman" w:hAnsi="Times New Roman" w:cs="Times New Roman"/>
-          <w:color w:val="0D0D0D" w:themeColor="text1" w:themeTint="F2"/>
-          <w:sz w:val="24"/>
-          <w:szCs w:val="24"/>
-        </w:rPr>
-        <w:t>informasi dasarnya.</w:t>
+        <w:t>Alur utama: Pelanggan membuka bagian menu unggulan; sistem menampilkan produk yang ditandai sebagai unggulan beserta informasi dasarnya.</w:t>
       </w:r>
     </w:p>
     <w:p>
@@ -25656,16 +24787,7 @@
           <w:sz w:val="24"/>
           <w:szCs w:val="24"/>
         </w:rPr>
-        <w:t>Aktor: Pelanggan. User Story terkait: US-</w:t>
-      </w:r>
-      <w:r>
-        <w:rPr>
-          <w:rFonts w:ascii="Times New Roman" w:hAnsi="Times New Roman" w:cs="Times New Roman"/>
-          <w:color w:val="0D0D0D" w:themeColor="text1" w:themeTint="F2"/>
-          <w:sz w:val="24"/>
-          <w:szCs w:val="24"/>
-        </w:rPr>
-        <w:t>06, US-23.</w:t>
+        <w:t>Aktor: Pelanggan. User Story terkait: US-06, US-23.</w:t>
       </w:r>
     </w:p>
     <w:p>
@@ -25761,16 +24883,7 @@
           <w:sz w:val="24"/>
           <w:szCs w:val="24"/>
         </w:rPr>
-        <w:t>Alur alternatif: Jika produk tidak</w:t>
-      </w:r>
-      <w:r>
-        <w:rPr>
-          <w:rFonts w:ascii="Times New Roman" w:hAnsi="Times New Roman" w:cs="Times New Roman"/>
-          <w:color w:val="0D0D0D" w:themeColor="text1" w:themeTint="F2"/>
-          <w:sz w:val="24"/>
-          <w:szCs w:val="24"/>
-        </w:rPr>
-        <w:t xml:space="preserve"> ditemukan, sistem memberi informasi yang sesuai dan menyediakan jalan kembali ke katalog.</w:t>
+        <w:t>Alur alternatif: Jika produk tidak ditemukan, sistem memberi informasi yang sesuai dan menyediakan jalan kembali ke katalog.</w:t>
       </w:r>
     </w:p>
     <w:p>
@@ -25847,16 +24960,7 @@
           <w:sz w:val="24"/>
           <w:szCs w:val="24"/>
         </w:rPr>
-        <w:t>Tujuan: Melanjutkan penelusuran setel</w:t>
-      </w:r>
-      <w:r>
-        <w:rPr>
-          <w:rFonts w:ascii="Times New Roman" w:hAnsi="Times New Roman" w:cs="Times New Roman"/>
-          <w:color w:val="0D0D0D" w:themeColor="text1" w:themeTint="F2"/>
-          <w:sz w:val="24"/>
-          <w:szCs w:val="24"/>
-        </w:rPr>
-        <w:t>ah melihat detail produk.</w:t>
+        <w:t>Tujuan: Melanjutkan penelusuran setelah melihat detail produk.</w:t>
       </w:r>
     </w:p>
     <w:p>
@@ -25914,16 +25018,7 @@
           <w:sz w:val="24"/>
           <w:szCs w:val="24"/>
         </w:rPr>
-        <w:t>Alur alternatif: Jika katalog gagal ditampilkan, sis</w:t>
-      </w:r>
-      <w:r>
-        <w:rPr>
-          <w:rFonts w:ascii="Times New Roman" w:hAnsi="Times New Roman" w:cs="Times New Roman"/>
-          <w:color w:val="0D0D0D" w:themeColor="text1" w:themeTint="F2"/>
-          <w:sz w:val="24"/>
-          <w:szCs w:val="24"/>
-        </w:rPr>
-        <w:t>tem memberi tahu bahwa menu belum dapat dimuat.</w:t>
+        <w:t>Alur alternatif: Jika katalog gagal ditampilkan, sistem memberi tahu bahwa menu belum dapat dimuat.</w:t>
       </w:r>
     </w:p>
     <w:p>
@@ -26019,16 +25114,7 @@
           <w:sz w:val="24"/>
           <w:szCs w:val="24"/>
         </w:rPr>
-        <w:t>Prasyarat: Produk dapat</w:t>
-      </w:r>
-      <w:r>
-        <w:rPr>
-          <w:rFonts w:ascii="Times New Roman" w:hAnsi="Times New Roman" w:cs="Times New Roman"/>
-          <w:color w:val="0D0D0D" w:themeColor="text1" w:themeTint="F2"/>
-          <w:sz w:val="24"/>
-          <w:szCs w:val="24"/>
-        </w:rPr>
-        <w:t xml:space="preserve"> dipilih.</w:t>
+        <w:t>Prasyarat: Produk dapat dipilih.</w:t>
       </w:r>
     </w:p>
     <w:p>
@@ -26086,16 +25172,7 @@
           <w:sz w:val="24"/>
           <w:szCs w:val="24"/>
         </w:rPr>
-        <w:t>Alur alternatif: Jika produk tidak tersedia untuk dipilih, sistem tidak menambahkannya dan memberi informasi kepada pela</w:t>
-      </w:r>
-      <w:r>
-        <w:rPr>
-          <w:rFonts w:ascii="Times New Roman" w:hAnsi="Times New Roman" w:cs="Times New Roman"/>
-          <w:color w:val="0D0D0D" w:themeColor="text1" w:themeTint="F2"/>
-          <w:sz w:val="24"/>
-          <w:szCs w:val="24"/>
-        </w:rPr>
-        <w:t>nggan.</w:t>
+        <w:t>Alur alternatif: Jika produk tidak tersedia untuk dipilih, sistem tidak menambahkannya dan memberi informasi kepada pelanggan.</w:t>
       </w:r>
     </w:p>
     <w:p>
@@ -26230,16 +25307,7 @@
           <w:sz w:val="24"/>
           <w:szCs w:val="24"/>
         </w:rPr>
-        <w:t>Alur utama: Pelanggan menaikkan jumla</w:t>
-      </w:r>
-      <w:r>
-        <w:rPr>
-          <w:rFonts w:ascii="Times New Roman" w:hAnsi="Times New Roman" w:cs="Times New Roman"/>
-          <w:color w:val="0D0D0D" w:themeColor="text1" w:themeTint="F2"/>
-          <w:sz w:val="24"/>
-          <w:szCs w:val="24"/>
-        </w:rPr>
-        <w:t>h suatu produk; sistem memperbarui jumlah dan perhitungan biaya.</w:t>
+        <w:t>Alur utama: Pelanggan menaikkan jumlah suatu produk; sistem memperbarui jumlah dan perhitungan biaya.</w:t>
       </w:r>
     </w:p>
     <w:p>
@@ -26297,16 +25365,7 @@
           <w:sz w:val="24"/>
           <w:szCs w:val="24"/>
         </w:rPr>
-        <w:t>UC-10 — Mengurangi</w:t>
-      </w:r>
-      <w:r>
-        <w:rPr>
-          <w:rFonts w:ascii="Times New Roman" w:hAnsi="Times New Roman" w:cs="Times New Roman"/>
-          <w:color w:val="0D0D0D" w:themeColor="text1" w:themeTint="F2"/>
-          <w:sz w:val="24"/>
-          <w:szCs w:val="24"/>
-        </w:rPr>
-        <w:t xml:space="preserve"> Jumlah Produk</w:t>
+        <w:t>UC-10 — Mengurangi Jumlah Produk</w:t>
       </w:r>
     </w:p>
     <w:p>
@@ -26401,16 +25460,7 @@
           <w:sz w:val="24"/>
           <w:szCs w:val="24"/>
         </w:rPr>
-        <w:t xml:space="preserve">Alur alternatif: </w:t>
-      </w:r>
-      <w:r>
-        <w:rPr>
-          <w:rFonts w:ascii="Times New Roman" w:hAnsi="Times New Roman" w:cs="Times New Roman"/>
-          <w:color w:val="0D0D0D" w:themeColor="text1" w:themeTint="F2"/>
-          <w:sz w:val="24"/>
-          <w:szCs w:val="24"/>
-        </w:rPr>
-        <w:t>Jika jumlah mencapai batas minimum, sistem mencegah jumlah tidak valid atau meminta pelanggan menghapus item.</w:t>
+        <w:t>Alur alternatif: Jika jumlah mencapai batas minimum, sistem mencegah jumlah tidak valid atau meminta pelanggan menghapus item.</w:t>
       </w:r>
     </w:p>
     <w:p>
@@ -26488,16 +25538,7 @@
           <w:sz w:val="24"/>
           <w:szCs w:val="24"/>
         </w:rPr>
-        <w:t>Tujua</w:t>
-      </w:r>
-      <w:r>
-        <w:rPr>
-          <w:rFonts w:ascii="Times New Roman" w:hAnsi="Times New Roman" w:cs="Times New Roman"/>
-          <w:color w:val="0D0D0D" w:themeColor="text1" w:themeTint="F2"/>
-          <w:sz w:val="24"/>
-          <w:szCs w:val="24"/>
-        </w:rPr>
-        <w:t>n: Membatalkan item yang tidak jadi dibeli atau salah dipilih.</w:t>
+        <w:t>Tujuan: Membatalkan item yang tidak jadi dibeli atau salah dipilih.</w:t>
       </w:r>
     </w:p>
     <w:p>
@@ -26574,16 +25615,7 @@
           <w:sz w:val="24"/>
           <w:szCs w:val="24"/>
         </w:rPr>
-        <w:t xml:space="preserve">Alur alternatif: Jika seluruh item dihapus, </w:t>
-      </w:r>
-      <w:r>
-        <w:rPr>
-          <w:rFonts w:ascii="Times New Roman" w:hAnsi="Times New Roman" w:cs="Times New Roman"/>
-          <w:color w:val="0D0D0D" w:themeColor="text1" w:themeTint="F2"/>
-          <w:sz w:val="24"/>
-          <w:szCs w:val="24"/>
-        </w:rPr>
-        <w:t>sistem menampilkan keranjang kosong.</w:t>
+        <w:t>Alur alternatif: Jika seluruh item dihapus, sistem menampilkan keranjang kosong.</w:t>
       </w:r>
     </w:p>
     <w:p>
@@ -26679,16 +25711,7 @@
           <w:sz w:val="24"/>
           <w:szCs w:val="24"/>
         </w:rPr>
-        <w:t>Prasyarat: K</w:t>
-      </w:r>
-      <w:r>
-        <w:rPr>
-          <w:rFonts w:ascii="Times New Roman" w:hAnsi="Times New Roman" w:cs="Times New Roman"/>
-          <w:color w:val="0D0D0D" w:themeColor="text1" w:themeTint="F2"/>
-          <w:sz w:val="24"/>
-          <w:szCs w:val="24"/>
-        </w:rPr>
-        <w:t>eranjang dapat dibuka.</w:t>
+        <w:t>Prasyarat: Keranjang dapat dibuka.</w:t>
       </w:r>
     </w:p>
     <w:p>
@@ -26745,16 +25768,7 @@
           <w:sz w:val="24"/>
           <w:szCs w:val="24"/>
         </w:rPr>
-        <w:t>Hasil: Pelanggan men</w:t>
-      </w:r>
-      <w:r>
-        <w:rPr>
-          <w:rFonts w:ascii="Times New Roman" w:hAnsi="Times New Roman" w:cs="Times New Roman"/>
-          <w:color w:val="0D0D0D" w:themeColor="text1" w:themeTint="F2"/>
-          <w:sz w:val="24"/>
-          <w:szCs w:val="24"/>
-        </w:rPr>
-        <w:t>getahui perkiraan biaya.</w:t>
+        <w:t>Hasil: Pelanggan mengetahui perkiraan biaya.</w:t>
       </w:r>
     </w:p>
     <w:p>
@@ -26860,16 +25874,7 @@
           <w:sz w:val="24"/>
           <w:szCs w:val="24"/>
         </w:rPr>
-        <w:t>na</w:t>
-      </w:r>
-      <w:r>
-        <w:rPr>
-          <w:rFonts w:ascii="Times New Roman" w:hAnsi="Times New Roman" w:cs="Times New Roman"/>
-          <w:color w:val="0D0D0D" w:themeColor="text1" w:themeTint="F2"/>
-          <w:sz w:val="24"/>
-          <w:szCs w:val="24"/>
-        </w:rPr>
-        <w:t>ma</w:t>
+        <w:t>nama</w:t>
       </w:r>
       <w:proofErr w:type="gramEnd"/>
       <w:r>
@@ -26976,16 +25981,7 @@
           <w:sz w:val="24"/>
           <w:szCs w:val="24"/>
         </w:rPr>
-        <w:t xml:space="preserve">Aktor: Pelanggan. User </w:t>
-      </w:r>
-      <w:r>
-        <w:rPr>
-          <w:rFonts w:ascii="Times New Roman" w:hAnsi="Times New Roman" w:cs="Times New Roman"/>
-          <w:color w:val="0D0D0D" w:themeColor="text1" w:themeTint="F2"/>
-          <w:sz w:val="24"/>
-          <w:szCs w:val="24"/>
-        </w:rPr>
-        <w:t>Story terkait: US-13.</w:t>
+        <w:t>Aktor: Pelanggan. User Story terkait: US-13.</w:t>
       </w:r>
     </w:p>
     <w:p>
@@ -27062,16 +26058,7 @@
           <w:szCs w:val="24"/>
         </w:rPr>
         <w:lastRenderedPageBreak/>
-        <w:t>Al</w:t>
-      </w:r>
-      <w:r>
-        <w:rPr>
-          <w:rFonts w:ascii="Times New Roman" w:hAnsi="Times New Roman" w:cs="Times New Roman"/>
-          <w:color w:val="0D0D0D" w:themeColor="text1" w:themeTint="F2"/>
-          <w:sz w:val="24"/>
-          <w:szCs w:val="24"/>
-        </w:rPr>
-        <w:t>ur alternatif: Jika meja tidak valid atau tidak aktif, sistem meminta pelanggan memilih meja yang tersedia.</w:t>
+        <w:t>Alur alternatif: Jika meja tidak valid atau tidak aktif, sistem meminta pelanggan memilih meja yang tersedia.</w:t>
       </w:r>
     </w:p>
     <w:p>
@@ -27148,16 +26135,7 @@
           <w:sz w:val="24"/>
           <w:szCs w:val="24"/>
         </w:rPr>
-        <w:t>Tujuan: Menyampaik</w:t>
-      </w:r>
-      <w:r>
-        <w:rPr>
-          <w:rFonts w:ascii="Times New Roman" w:hAnsi="Times New Roman" w:cs="Times New Roman"/>
-          <w:color w:val="0D0D0D" w:themeColor="text1" w:themeTint="F2"/>
-          <w:sz w:val="24"/>
-          <w:szCs w:val="24"/>
-        </w:rPr>
-        <w:t>an permintaan khusus terkait pesanan.</w:t>
+        <w:t>Tujuan: Menyampaikan permintaan khusus terkait pesanan.</w:t>
       </w:r>
     </w:p>
     <w:p>
@@ -27214,16 +26192,7 @@
           <w:sz w:val="24"/>
           <w:szCs w:val="24"/>
         </w:rPr>
-        <w:t>Alur alternatif: Jika catatan tidak diisi, pesanan dapat dilanjutkan tanpa catat</w:t>
-      </w:r>
-      <w:r>
-        <w:rPr>
-          <w:rFonts w:ascii="Times New Roman" w:hAnsi="Times New Roman" w:cs="Times New Roman"/>
-          <w:color w:val="0D0D0D" w:themeColor="text1" w:themeTint="F2"/>
-          <w:sz w:val="24"/>
-          <w:szCs w:val="24"/>
-        </w:rPr>
-        <w:t>an.</w:t>
+        <w:t>Alur alternatif: Jika catatan tidak diisi, pesanan dapat dilanjutkan tanpa catatan.</w:t>
       </w:r>
     </w:p>
     <w:p>
@@ -27319,16 +26288,7 @@
           <w:sz w:val="24"/>
           <w:szCs w:val="24"/>
         </w:rPr>
-        <w:t>Prasyarat: Keranjang berisi produ</w:t>
-      </w:r>
-      <w:r>
-        <w:rPr>
-          <w:rFonts w:ascii="Times New Roman" w:hAnsi="Times New Roman" w:cs="Times New Roman"/>
-          <w:color w:val="0D0D0D" w:themeColor="text1" w:themeTint="F2"/>
-          <w:sz w:val="24"/>
-          <w:szCs w:val="24"/>
-        </w:rPr>
-        <w:t>k dan data wajib tersedia.</w:t>
+        <w:t>Prasyarat: Keranjang berisi produk dan data wajib tersedia.</w:t>
       </w:r>
     </w:p>
     <w:p>
@@ -27366,16 +26326,7 @@
           <w:sz w:val="24"/>
           <w:szCs w:val="24"/>
         </w:rPr>
-        <w:t>Alur alternatif: Jika keranjang kosong atau data wajib tidak valid, pesanan tidak dikirim dan pelanggan dimint</w:t>
-      </w:r>
-      <w:r>
-        <w:rPr>
-          <w:rFonts w:ascii="Times New Roman" w:hAnsi="Times New Roman" w:cs="Times New Roman"/>
-          <w:color w:val="0D0D0D" w:themeColor="text1" w:themeTint="F2"/>
-          <w:sz w:val="24"/>
-          <w:szCs w:val="24"/>
-        </w:rPr>
-        <w:t>a memperbaiki data.</w:t>
+        <w:t>Alur alternatif: Jika keranjang kosong atau data wajib tidak valid, pesanan tidak dikirim dan pelanggan diminta memperbaiki data.</w:t>
       </w:r>
     </w:p>
     <w:p>
@@ -27471,16 +26422,7 @@
           <w:sz w:val="24"/>
           <w:szCs w:val="24"/>
         </w:rPr>
-        <w:t xml:space="preserve">Prasyarat: Pelanggan pernah </w:t>
-      </w:r>
-      <w:r>
-        <w:rPr>
-          <w:rFonts w:ascii="Times New Roman" w:hAnsi="Times New Roman" w:cs="Times New Roman"/>
-          <w:color w:val="0D0D0D" w:themeColor="text1" w:themeTint="F2"/>
-          <w:sz w:val="24"/>
-          <w:szCs w:val="24"/>
-        </w:rPr>
-        <w:t>membuat pesanan pada sesi yang digunakan.</w:t>
+        <w:t>Prasyarat: Pelanggan pernah membuat pesanan pada sesi yang digunakan.</w:t>
       </w:r>
     </w:p>
     <w:p>
@@ -27537,16 +26479,7 @@
           <w:sz w:val="24"/>
           <w:szCs w:val="24"/>
         </w:rPr>
-        <w:t>Hasil: Pe</w:t>
-      </w:r>
-      <w:r>
-        <w:rPr>
-          <w:rFonts w:ascii="Times New Roman" w:hAnsi="Times New Roman" w:cs="Times New Roman"/>
-          <w:color w:val="0D0D0D" w:themeColor="text1" w:themeTint="F2"/>
-          <w:sz w:val="24"/>
-          <w:szCs w:val="24"/>
-        </w:rPr>
-        <w:t>langgan dapat melihat pesanan yang telah dibuat.</w:t>
+        <w:t>Hasil: Pelanggan dapat melihat pesanan yang telah dibuat.</w:t>
       </w:r>
     </w:p>
     <w:p>
@@ -27643,16 +26576,7 @@
           <w:sz w:val="24"/>
           <w:szCs w:val="24"/>
         </w:rPr>
-        <w:t xml:space="preserve">Alur utama: Pelanggan </w:t>
-      </w:r>
-      <w:r>
-        <w:rPr>
-          <w:rFonts w:ascii="Times New Roman" w:hAnsi="Times New Roman" w:cs="Times New Roman"/>
-          <w:color w:val="0D0D0D" w:themeColor="text1" w:themeTint="F2"/>
-          <w:sz w:val="24"/>
-          <w:szCs w:val="24"/>
-        </w:rPr>
-        <w:t>memilih pesanan; sistem menampilkan status terakhir yang tercatat.</w:t>
+        <w:t>Alur utama: Pelanggan memilih pesanan; sistem menampilkan status terakhir yang tercatat.</w:t>
       </w:r>
     </w:p>
     <w:p>
@@ -27710,16 +26634,7 @@
           <w:sz w:val="24"/>
           <w:szCs w:val="24"/>
         </w:rPr>
-        <w:t>UC-19 — Melihat Rincian</w:t>
-      </w:r>
-      <w:r>
-        <w:rPr>
-          <w:rFonts w:ascii="Times New Roman" w:hAnsi="Times New Roman" w:cs="Times New Roman"/>
-          <w:color w:val="0D0D0D" w:themeColor="text1" w:themeTint="F2"/>
-          <w:sz w:val="24"/>
-          <w:szCs w:val="24"/>
-        </w:rPr>
-        <w:t xml:space="preserve"> dan Total Pesanan</w:t>
+        <w:t>UC-19 — Melihat Rincian dan Total Pesanan</w:t>
       </w:r>
     </w:p>
     <w:p>
@@ -27795,16 +26710,7 @@
           <w:sz w:val="24"/>
           <w:szCs w:val="24"/>
         </w:rPr>
-        <w:t>Alur utama: Pelanggan membuka rincian pesanan; siste</w:t>
-      </w:r>
-      <w:r>
-        <w:rPr>
-          <w:rFonts w:ascii="Times New Roman" w:hAnsi="Times New Roman" w:cs="Times New Roman"/>
-          <w:color w:val="0D0D0D" w:themeColor="text1" w:themeTint="F2"/>
-          <w:sz w:val="24"/>
-          <w:szCs w:val="24"/>
-        </w:rPr>
-        <w:t>m menampilkan item, jumlah, dan total biaya.</w:t>
+        <w:t>Alur utama: Pelanggan membuka rincian pesanan; sistem menampilkan item, jumlah, dan total biaya.</w:t>
       </w:r>
     </w:p>
     <w:p>
@@ -27881,16 +26787,7 @@
           <w:sz w:val="24"/>
           <w:szCs w:val="24"/>
         </w:rPr>
-        <w:t>Aktor: Pelanggan.</w:t>
-      </w:r>
-      <w:r>
-        <w:rPr>
-          <w:rFonts w:ascii="Times New Roman" w:hAnsi="Times New Roman" w:cs="Times New Roman"/>
-          <w:color w:val="0D0D0D" w:themeColor="text1" w:themeTint="F2"/>
-          <w:sz w:val="24"/>
-          <w:szCs w:val="24"/>
-        </w:rPr>
-        <w:t xml:space="preserve"> User Story terkait: US-25.</w:t>
+        <w:t>Aktor: Pelanggan. User Story terkait: US-25.</w:t>
       </w:r>
     </w:p>
     <w:p>
@@ -27986,16 +26883,7 @@
           <w:sz w:val="24"/>
           <w:szCs w:val="24"/>
         </w:rPr>
-        <w:t>Alur alternatif: J</w:t>
-      </w:r>
-      <w:r>
-        <w:rPr>
-          <w:rFonts w:ascii="Times New Roman" w:hAnsi="Times New Roman" w:cs="Times New Roman"/>
-          <w:color w:val="0D0D0D" w:themeColor="text1" w:themeTint="F2"/>
-          <w:sz w:val="24"/>
-          <w:szCs w:val="24"/>
-        </w:rPr>
-        <w:t>ika informasi tertentu belum diisi, sistem tidak menampilkan data yang direka.</w:t>
+        <w:t>Alur alternatif: Jika informasi tertentu belum diisi, sistem tidak menampilkan data yang direka.</w:t>
       </w:r>
     </w:p>
     <w:p>
@@ -28091,16 +26979,7 @@
           <w:sz w:val="24"/>
           <w:szCs w:val="24"/>
         </w:rPr>
-        <w:t>Prasyarat: Akun admin tela</w:t>
-      </w:r>
-      <w:r>
-        <w:rPr>
-          <w:rFonts w:ascii="Times New Roman" w:hAnsi="Times New Roman" w:cs="Times New Roman"/>
-          <w:color w:val="0D0D0D" w:themeColor="text1" w:themeTint="F2"/>
-          <w:sz w:val="24"/>
-          <w:szCs w:val="24"/>
-        </w:rPr>
-        <w:t>h tersedia.</w:t>
+        <w:t>Prasyarat: Akun admin telah tersedia.</w:t>
       </w:r>
     </w:p>
     <w:p>
@@ -28157,16 +27036,7 @@
           <w:sz w:val="24"/>
           <w:szCs w:val="24"/>
         </w:rPr>
-        <w:t>Hasil: Admin berhasil masuk atau tetap tidak terautenti</w:t>
-      </w:r>
-      <w:r>
-        <w:rPr>
-          <w:rFonts w:ascii="Times New Roman" w:hAnsi="Times New Roman" w:cs="Times New Roman"/>
-          <w:color w:val="0D0D0D" w:themeColor="text1" w:themeTint="F2"/>
-          <w:sz w:val="24"/>
-          <w:szCs w:val="24"/>
-        </w:rPr>
-        <w:t>kasi.</w:t>
+        <w:t>Hasil: Admin berhasil masuk atau tetap tidak terautentikasi.</w:t>
       </w:r>
     </w:p>
     <w:p>
@@ -28263,16 +27133,7 @@
           <w:sz w:val="24"/>
           <w:szCs w:val="24"/>
         </w:rPr>
-        <w:t xml:space="preserve">Alur utama: Admin membuka dashboard; sistem menampilkan ringkasan data yang disediakan </w:t>
-      </w:r>
-      <w:r>
-        <w:rPr>
-          <w:rFonts w:ascii="Times New Roman" w:hAnsi="Times New Roman" w:cs="Times New Roman"/>
-          <w:color w:val="0D0D0D" w:themeColor="text1" w:themeTint="F2"/>
-          <w:sz w:val="24"/>
-          <w:szCs w:val="24"/>
-        </w:rPr>
-        <w:t>aplikasi.</w:t>
+        <w:t>Alur utama: Admin membuka dashboard; sistem menampilkan ringkasan data yang disediakan aplikasi.</w:t>
       </w:r>
     </w:p>
     <w:p>
@@ -28368,16 +27229,7 @@
           <w:sz w:val="24"/>
           <w:szCs w:val="24"/>
         </w:rPr>
-        <w:t>Tujuan: Meninjau produk yang d</w:t>
-      </w:r>
-      <w:r>
-        <w:rPr>
-          <w:rFonts w:ascii="Times New Roman" w:hAnsi="Times New Roman" w:cs="Times New Roman"/>
-          <w:color w:val="0D0D0D" w:themeColor="text1" w:themeTint="F2"/>
-          <w:sz w:val="24"/>
-          <w:szCs w:val="24"/>
-        </w:rPr>
-        <w:t>ikelola.</w:t>
+        <w:t>Tujuan: Meninjau produk yang dikelola.</w:t>
       </w:r>
     </w:p>
     <w:p>
@@ -28453,16 +27305,7 @@
           <w:sz w:val="24"/>
           <w:szCs w:val="24"/>
         </w:rPr>
-        <w:t xml:space="preserve">Hasil: Admin dapat meninjau produk </w:t>
-      </w:r>
-      <w:r>
-        <w:rPr>
-          <w:rFonts w:ascii="Times New Roman" w:hAnsi="Times New Roman" w:cs="Times New Roman"/>
-          <w:color w:val="0D0D0D" w:themeColor="text1" w:themeTint="F2"/>
-          <w:sz w:val="24"/>
-          <w:szCs w:val="24"/>
-        </w:rPr>
-        <w:t>yang terdaftar.</w:t>
+        <w:t>Hasil: Admin dapat meninjau produk yang terdaftar.</w:t>
       </w:r>
     </w:p>
     <w:p>
@@ -28558,16 +27401,7 @@
           <w:sz w:val="24"/>
           <w:szCs w:val="24"/>
         </w:rPr>
-        <w:t>Alur utama: Admin mengisi informasi produk yang diperlukan dan menyimpan; sistem menampilkan p</w:t>
-      </w:r>
-      <w:r>
-        <w:rPr>
-          <w:rFonts w:ascii="Times New Roman" w:hAnsi="Times New Roman" w:cs="Times New Roman"/>
-          <w:color w:val="0D0D0D" w:themeColor="text1" w:themeTint="F2"/>
-          <w:sz w:val="24"/>
-          <w:szCs w:val="24"/>
-        </w:rPr>
-        <w:t>roduk yang berhasil ditambahkan.</w:t>
+        <w:t>Alur utama: Admin mengisi informasi produk yang diperlukan dan menyimpan; sistem menampilkan produk yang berhasil ditambahkan.</w:t>
       </w:r>
     </w:p>
     <w:p>
@@ -28644,16 +27478,7 @@
           <w:sz w:val="24"/>
           <w:szCs w:val="24"/>
         </w:rPr>
-        <w:t>Aktor: Adm</w:t>
-      </w:r>
-      <w:r>
-        <w:rPr>
-          <w:rFonts w:ascii="Times New Roman" w:hAnsi="Times New Roman" w:cs="Times New Roman"/>
-          <w:color w:val="0D0D0D" w:themeColor="text1" w:themeTint="F2"/>
-          <w:sz w:val="24"/>
-          <w:szCs w:val="24"/>
-        </w:rPr>
-        <w:t xml:space="preserve">in. User Story terkait: US-30, US-32, </w:t>
+        <w:t xml:space="preserve">Aktor: Admin. User Story terkait: US-30, US-32, </w:t>
       </w:r>
       <w:proofErr w:type="gramStart"/>
       <w:r>
@@ -28770,16 +27595,7 @@
           <w:sz w:val="24"/>
           <w:szCs w:val="24"/>
         </w:rPr>
-        <w:t>, deskrips</w:t>
-      </w:r>
-      <w:r>
-        <w:rPr>
-          <w:rFonts w:ascii="Times New Roman" w:hAnsi="Times New Roman" w:cs="Times New Roman"/>
-          <w:color w:val="0D0D0D" w:themeColor="text1" w:themeTint="F2"/>
-          <w:sz w:val="24"/>
-          <w:szCs w:val="24"/>
-        </w:rPr>
-        <w:t>i, harga, kategori, penandaan unggulan atau status ketersediaan; lalu menyimpan perubahan.</w:t>
+        <w:t>, deskripsi, harga, kategori, penandaan unggulan atau status ketersediaan; lalu menyimpan perubahan.</w:t>
       </w:r>
     </w:p>
     <w:p>
@@ -28818,16 +27634,7 @@
           <w:szCs w:val="24"/>
         </w:rPr>
         <w:lastRenderedPageBreak/>
-        <w:t xml:space="preserve">Hasil: Informasi produk mengikuti perubahan yang </w:t>
-      </w:r>
-      <w:r>
-        <w:rPr>
-          <w:rFonts w:ascii="Times New Roman" w:hAnsi="Times New Roman" w:cs="Times New Roman"/>
-          <w:color w:val="0D0D0D" w:themeColor="text1" w:themeTint="F2"/>
-          <w:sz w:val="24"/>
-          <w:szCs w:val="24"/>
-        </w:rPr>
-        <w:t>tersimpan.</w:t>
+        <w:t>Hasil: Informasi produk mengikuti perubahan yang tersimpan.</w:t>
       </w:r>
     </w:p>
     <w:p>
@@ -28923,16 +27730,7 @@
           <w:sz w:val="24"/>
           <w:szCs w:val="24"/>
         </w:rPr>
-        <w:t xml:space="preserve">Alur utama: Admin memilih produk dan meminta penghapusan; sistem </w:t>
-      </w:r>
-      <w:r>
-        <w:rPr>
-          <w:rFonts w:ascii="Times New Roman" w:hAnsi="Times New Roman" w:cs="Times New Roman"/>
-          <w:color w:val="0D0D0D" w:themeColor="text1" w:themeTint="F2"/>
-          <w:sz w:val="24"/>
-          <w:szCs w:val="24"/>
-        </w:rPr>
-        <w:t>meminta konfirmasi bila diperlukan lalu menghapus produk dari daftar.</w:t>
+        <w:t>Alur utama: Admin memilih produk dan meminta penghapusan; sistem meminta konfirmasi bila diperlukan lalu menghapus produk dari daftar.</w:t>
       </w:r>
     </w:p>
     <w:p>
@@ -28990,16 +27788,7 @@
           <w:sz w:val="24"/>
           <w:szCs w:val="24"/>
         </w:rPr>
-        <w:t>UC-27 — M</w:t>
-      </w:r>
-      <w:r>
-        <w:rPr>
-          <w:rFonts w:ascii="Times New Roman" w:hAnsi="Times New Roman" w:cs="Times New Roman"/>
-          <w:color w:val="0D0D0D" w:themeColor="text1" w:themeTint="F2"/>
-          <w:sz w:val="24"/>
-          <w:szCs w:val="24"/>
-        </w:rPr>
-        <w:t>engelola Gambar Produk</w:t>
+        <w:t>UC-27 — Mengelola Gambar Produk</w:t>
       </w:r>
     </w:p>
     <w:p>
@@ -29095,16 +27884,7 @@
           <w:sz w:val="24"/>
           <w:szCs w:val="24"/>
         </w:rPr>
-        <w:t>Alur utama: Admin mengunggah atau mengganti gambar pro</w:t>
-      </w:r>
-      <w:r>
-        <w:rPr>
-          <w:rFonts w:ascii="Times New Roman" w:hAnsi="Times New Roman" w:cs="Times New Roman"/>
-          <w:color w:val="0D0D0D" w:themeColor="text1" w:themeTint="F2"/>
-          <w:sz w:val="24"/>
-          <w:szCs w:val="24"/>
-        </w:rPr>
-        <w:t>duk yang didukung, atau menghapus gambar yang tidak digunakan; sistem menampilkan hasil perubahan.</w:t>
+        <w:t>Alur utama: Admin mengunggah atau mengganti gambar produk yang didukung, atau menghapus gambar yang tidak digunakan; sistem menampilkan hasil perubahan.</w:t>
       </w:r>
     </w:p>
     <w:p>
@@ -29142,16 +27922,7 @@
           <w:sz w:val="24"/>
           <w:szCs w:val="24"/>
         </w:rPr>
-        <w:t>Hasil: Gambar produk mencerminkan perub</w:t>
-      </w:r>
-      <w:r>
-        <w:rPr>
-          <w:rFonts w:ascii="Times New Roman" w:hAnsi="Times New Roman" w:cs="Times New Roman"/>
-          <w:color w:val="0D0D0D" w:themeColor="text1" w:themeTint="F2"/>
-          <w:sz w:val="24"/>
-          <w:szCs w:val="24"/>
-        </w:rPr>
-        <w:t>ahan yang berhasil dilakukan.</w:t>
+        <w:t>Hasil: Gambar produk mencerminkan perubahan yang berhasil dilakukan.</w:t>
       </w:r>
     </w:p>
     <w:p>
@@ -29247,16 +28018,7 @@
           <w:sz w:val="24"/>
           <w:szCs w:val="24"/>
         </w:rPr>
-        <w:t>Alur utama: Admin membuka pengelolaan kategori; sistem menampilkan dafta</w:t>
-      </w:r>
-      <w:r>
-        <w:rPr>
-          <w:rFonts w:ascii="Times New Roman" w:hAnsi="Times New Roman" w:cs="Times New Roman"/>
-          <w:color w:val="0D0D0D" w:themeColor="text1" w:themeTint="F2"/>
-          <w:sz w:val="24"/>
-          <w:szCs w:val="24"/>
-        </w:rPr>
-        <w:t>r kategori.</w:t>
+        <w:t>Alur utama: Admin membuka pengelolaan kategori; sistem menampilkan daftar kategori.</w:t>
       </w:r>
     </w:p>
     <w:p>
@@ -29371,16 +28133,7 @@
           <w:sz w:val="24"/>
           <w:szCs w:val="24"/>
         </w:rPr>
-        <w:t xml:space="preserve">Prasyarat: Admin </w:t>
-      </w:r>
-      <w:r>
-        <w:rPr>
-          <w:rFonts w:ascii="Times New Roman" w:hAnsi="Times New Roman" w:cs="Times New Roman"/>
-          <w:color w:val="0D0D0D" w:themeColor="text1" w:themeTint="F2"/>
-          <w:sz w:val="24"/>
-          <w:szCs w:val="24"/>
-        </w:rPr>
-        <w:t>telah login.</w:t>
+        <w:t>Prasyarat: Admin telah login.</w:t>
       </w:r>
     </w:p>
     <w:p>
@@ -29478,16 +28231,7 @@
           <w:sz w:val="24"/>
           <w:szCs w:val="24"/>
         </w:rPr>
-        <w:t>Hasil: Kategori baru tersedia untuk pengelompok</w:t>
-      </w:r>
-      <w:r>
-        <w:rPr>
-          <w:rFonts w:ascii="Times New Roman" w:hAnsi="Times New Roman" w:cs="Times New Roman"/>
-          <w:color w:val="0D0D0D" w:themeColor="text1" w:themeTint="F2"/>
-          <w:sz w:val="24"/>
-          <w:szCs w:val="24"/>
-        </w:rPr>
-        <w:t>an menu.</w:t>
+        <w:t>Hasil: Kategori baru tersedia untuk pengelompokan menu.</w:t>
       </w:r>
     </w:p>
     <w:p>
@@ -29603,16 +28347,7 @@
           <w:sz w:val="24"/>
           <w:szCs w:val="24"/>
         </w:rPr>
-        <w:t xml:space="preserve">Alur utama: Admin memilih kategori, mengubah namanya, lalu menyimpan; sistem </w:t>
-      </w:r>
-      <w:r>
-        <w:rPr>
-          <w:rFonts w:ascii="Times New Roman" w:hAnsi="Times New Roman" w:cs="Times New Roman"/>
-          <w:color w:val="0D0D0D" w:themeColor="text1" w:themeTint="F2"/>
-          <w:sz w:val="24"/>
-          <w:szCs w:val="24"/>
-        </w:rPr>
-        <w:t xml:space="preserve">menampilkan </w:t>
+        <w:t xml:space="preserve">Alur utama: Admin memilih kategori, mengubah namanya, lalu menyimpan; sistem menampilkan </w:t>
       </w:r>
       <w:proofErr w:type="gramStart"/>
       <w:r>
@@ -29748,16 +28483,7 @@
           <w:sz w:val="24"/>
           <w:szCs w:val="24"/>
         </w:rPr>
-        <w:t>Tujuan: Menamp</w:t>
-      </w:r>
-      <w:r>
-        <w:rPr>
-          <w:rFonts w:ascii="Times New Roman" w:hAnsi="Times New Roman" w:cs="Times New Roman"/>
-          <w:color w:val="0D0D0D" w:themeColor="text1" w:themeTint="F2"/>
-          <w:sz w:val="24"/>
-          <w:szCs w:val="24"/>
-        </w:rPr>
-        <w:t>ilkan kategori sesuai prioritas yang diinginkan.</w:t>
+        <w:t>Tujuan: Menampilkan kategori sesuai prioritas yang diinginkan.</w:t>
       </w:r>
     </w:p>
     <w:p>
@@ -29814,16 +28540,7 @@
           <w:sz w:val="24"/>
           <w:szCs w:val="24"/>
         </w:rPr>
-        <w:t>Alur alternatif: Jika urutan tidak dapat disimpan, sistem memberi i</w:t>
-      </w:r>
-      <w:r>
-        <w:rPr>
-          <w:rFonts w:ascii="Times New Roman" w:hAnsi="Times New Roman" w:cs="Times New Roman"/>
-          <w:color w:val="0D0D0D" w:themeColor="text1" w:themeTint="F2"/>
-          <w:sz w:val="24"/>
-          <w:szCs w:val="24"/>
-        </w:rPr>
-        <w:t>nformasi dan mempertahankan urutan sebelumnya.</w:t>
+        <w:t>Alur alternatif: Jika urutan tidak dapat disimpan, sistem memberi informasi dan mempertahankan urutan sebelumnya.</w:t>
       </w:r>
     </w:p>
     <w:p>
@@ -29919,16 +28636,7 @@
           <w:sz w:val="24"/>
           <w:szCs w:val="24"/>
         </w:rPr>
-        <w:t>Prasyarat: Admin telah login dan</w:t>
-      </w:r>
-      <w:r>
-        <w:rPr>
-          <w:rFonts w:ascii="Times New Roman" w:hAnsi="Times New Roman" w:cs="Times New Roman"/>
-          <w:color w:val="0D0D0D" w:themeColor="text1" w:themeTint="F2"/>
-          <w:sz w:val="24"/>
-          <w:szCs w:val="24"/>
-        </w:rPr>
-        <w:t xml:space="preserve"> kategori tersedia.</w:t>
+        <w:t>Prasyarat: Admin telah login dan kategori tersedia.</w:t>
       </w:r>
     </w:p>
     <w:p>
@@ -29966,16 +28674,7 @@
           <w:sz w:val="24"/>
           <w:szCs w:val="24"/>
         </w:rPr>
-        <w:t>Alur alternatif: Jika kategori masih digunakan atau tidak dapat dihapus, sistem menolak tin</w:t>
-      </w:r>
-      <w:r>
-        <w:rPr>
-          <w:rFonts w:ascii="Times New Roman" w:hAnsi="Times New Roman" w:cs="Times New Roman"/>
-          <w:color w:val="0D0D0D" w:themeColor="text1" w:themeTint="F2"/>
-          <w:sz w:val="24"/>
-          <w:szCs w:val="24"/>
-        </w:rPr>
-        <w:t>dakan dan menjelaskan alasannya.</w:t>
+        <w:t>Alur alternatif: Jika kategori masih digunakan atau tidak dapat dihapus, sistem menolak tindakan dan menjelaskan alasannya.</w:t>
       </w:r>
     </w:p>
     <w:p>
@@ -30091,16 +28790,7 @@
           <w:sz w:val="24"/>
           <w:szCs w:val="24"/>
         </w:rPr>
-        <w:t>Alur uta</w:t>
-      </w:r>
-      <w:r>
-        <w:rPr>
-          <w:rFonts w:ascii="Times New Roman" w:hAnsi="Times New Roman" w:cs="Times New Roman"/>
-          <w:color w:val="0D0D0D" w:themeColor="text1" w:themeTint="F2"/>
-          <w:sz w:val="24"/>
-          <w:szCs w:val="24"/>
-        </w:rPr>
-        <w:t>ma: Admin membuka daftar pesanan; sistem menampilkan pesanan masuk beserta status yang tercatat.</w:t>
+        <w:t>Alur utama: Admin membuka daftar pesanan; sistem menampilkan pesanan masuk beserta status yang tercatat.</w:t>
       </w:r>
     </w:p>
     <w:p>
@@ -30158,16 +28848,7 @@
           <w:sz w:val="24"/>
           <w:szCs w:val="24"/>
         </w:rPr>
-        <w:t>UC-34 — Memfilter Pesanan Berdasarkan St</w:t>
-      </w:r>
-      <w:r>
-        <w:rPr>
-          <w:rFonts w:ascii="Times New Roman" w:hAnsi="Times New Roman" w:cs="Times New Roman"/>
-          <w:color w:val="0D0D0D" w:themeColor="text1" w:themeTint="F2"/>
-          <w:sz w:val="24"/>
-          <w:szCs w:val="24"/>
-        </w:rPr>
-        <w:t>atus</w:t>
+        <w:t>UC-34 — Memfilter Pesanan Berdasarkan Status</w:t>
       </w:r>
     </w:p>
     <w:p>
@@ -30243,16 +28924,7 @@
           <w:sz w:val="24"/>
           <w:szCs w:val="24"/>
         </w:rPr>
-        <w:t xml:space="preserve">Alur utama: Admin memilih status sebagai filter; sistem menampilkan pesanan yang </w:t>
-      </w:r>
-      <w:r>
-        <w:rPr>
-          <w:rFonts w:ascii="Times New Roman" w:hAnsi="Times New Roman" w:cs="Times New Roman"/>
-          <w:color w:val="0D0D0D" w:themeColor="text1" w:themeTint="F2"/>
-          <w:sz w:val="24"/>
-          <w:szCs w:val="24"/>
-        </w:rPr>
-        <w:t>sesuai.</w:t>
+        <w:t>Alur utama: Admin memilih status sebagai filter; sistem menampilkan pesanan yang sesuai.</w:t>
       </w:r>
     </w:p>
     <w:p>
@@ -30348,16 +29020,7 @@
           <w:sz w:val="24"/>
           <w:szCs w:val="24"/>
         </w:rPr>
-        <w:t>Tu</w:t>
-      </w:r>
-      <w:r>
-        <w:rPr>
-          <w:rFonts w:ascii="Times New Roman" w:hAnsi="Times New Roman" w:cs="Times New Roman"/>
-          <w:color w:val="0D0D0D" w:themeColor="text1" w:themeTint="F2"/>
-          <w:sz w:val="24"/>
-          <w:szCs w:val="24"/>
-        </w:rPr>
-        <w:t>juan: Memeriksa item, meja, catatan, dan total pesanan.</w:t>
+        <w:t>Tujuan: Memeriksa item, meja, catatan, dan total pesanan.</w:t>
       </w:r>
     </w:p>
     <w:p>
@@ -30414,16 +29077,7 @@
           <w:sz w:val="24"/>
           <w:szCs w:val="24"/>
         </w:rPr>
-        <w:t>Alur alternatif: Jika pesanan tidak dite</w:t>
-      </w:r>
-      <w:r>
-        <w:rPr>
-          <w:rFonts w:ascii="Times New Roman" w:hAnsi="Times New Roman" w:cs="Times New Roman"/>
-          <w:color w:val="0D0D0D" w:themeColor="text1" w:themeTint="F2"/>
-          <w:sz w:val="24"/>
-          <w:szCs w:val="24"/>
-        </w:rPr>
-        <w:t>mukan, sistem memberi informasi yang sesuai.</w:t>
+        <w:t>Alur alternatif: Jika pesanan tidak ditemukan, sistem memberi informasi yang sesuai.</w:t>
       </w:r>
     </w:p>
     <w:p>
@@ -30519,16 +29173,7 @@
           <w:sz w:val="24"/>
           <w:szCs w:val="24"/>
         </w:rPr>
-        <w:t>Prasyarat: Admin telah login dan pesan</w:t>
-      </w:r>
-      <w:r>
-        <w:rPr>
-          <w:rFonts w:ascii="Times New Roman" w:hAnsi="Times New Roman" w:cs="Times New Roman"/>
-          <w:color w:val="0D0D0D" w:themeColor="text1" w:themeTint="F2"/>
-          <w:sz w:val="24"/>
-          <w:szCs w:val="24"/>
-        </w:rPr>
-        <w:t>an tersedia.</w:t>
+        <w:t>Prasyarat: Admin telah login dan pesanan tersedia.</w:t>
       </w:r>
     </w:p>
     <w:p>
@@ -30585,16 +29230,7 @@
           <w:sz w:val="24"/>
           <w:szCs w:val="24"/>
         </w:rPr>
-        <w:t xml:space="preserve">Hasil: </w:t>
-      </w:r>
-      <w:r>
-        <w:rPr>
-          <w:rFonts w:ascii="Times New Roman" w:hAnsi="Times New Roman" w:cs="Times New Roman"/>
-          <w:color w:val="0D0D0D" w:themeColor="text1" w:themeTint="F2"/>
-          <w:sz w:val="24"/>
-          <w:szCs w:val="24"/>
-        </w:rPr>
-        <w:t>Status pesanan mencerminkan perubahan yang berhasil.</w:t>
+        <w:t>Hasil: Status pesanan mencerminkan perubahan yang berhasil.</w:t>
       </w:r>
     </w:p>
     <w:p>
@@ -30691,16 +29327,7 @@
           <w:sz w:val="24"/>
           <w:szCs w:val="24"/>
         </w:rPr>
-        <w:t>Alur utama: Admin membuka pengelolaan meja; sistem menampilkan kod</w:t>
-      </w:r>
-      <w:r>
-        <w:rPr>
-          <w:rFonts w:ascii="Times New Roman" w:hAnsi="Times New Roman" w:cs="Times New Roman"/>
-          <w:color w:val="0D0D0D" w:themeColor="text1" w:themeTint="F2"/>
-          <w:sz w:val="24"/>
-          <w:szCs w:val="24"/>
-        </w:rPr>
-        <w:t xml:space="preserve">e atau </w:t>
+        <w:t xml:space="preserve">Alur utama: Admin membuka pengelolaan meja; sistem menampilkan kode atau </w:t>
       </w:r>
       <w:proofErr w:type="gramStart"/>
       <w:r>
@@ -30816,16 +29443,7 @@
           <w:sz w:val="24"/>
           <w:szCs w:val="24"/>
         </w:rPr>
-        <w:t xml:space="preserve">Tujuan: Menjaga identitas meja </w:t>
-      </w:r>
-      <w:r>
-        <w:rPr>
-          <w:rFonts w:ascii="Times New Roman" w:hAnsi="Times New Roman" w:cs="Times New Roman"/>
-          <w:color w:val="0D0D0D" w:themeColor="text1" w:themeTint="F2"/>
-          <w:sz w:val="24"/>
-          <w:szCs w:val="24"/>
-        </w:rPr>
-        <w:t>sesuai kondisi kafe.</w:t>
+        <w:t>Tujuan: Menjaga identitas meja sesuai kondisi kafe.</w:t>
       </w:r>
     </w:p>
     <w:p>
@@ -30882,16 +29500,7 @@
           <w:sz w:val="24"/>
           <w:szCs w:val="24"/>
         </w:rPr>
-        <w:t xml:space="preserve">Alur alternatif: Jika kode kosong atau duplikat, sistem menolak perubahan </w:t>
-      </w:r>
-      <w:r>
-        <w:rPr>
-          <w:rFonts w:ascii="Times New Roman" w:hAnsi="Times New Roman" w:cs="Times New Roman"/>
-          <w:color w:val="0D0D0D" w:themeColor="text1" w:themeTint="F2"/>
-          <w:sz w:val="24"/>
-          <w:szCs w:val="24"/>
-        </w:rPr>
-        <w:t>dan memberi informasi.</w:t>
+        <w:t>Alur alternatif: Jika kode kosong atau duplikat, sistem menolak perubahan dan memberi informasi.</w:t>
       </w:r>
     </w:p>
     <w:p>
@@ -31007,16 +29616,7 @@
           <w:sz w:val="24"/>
           <w:szCs w:val="24"/>
         </w:rPr>
-        <w:t>Prasyarat: Admin telah login dan meja tersedia</w:t>
-      </w:r>
-      <w:r>
-        <w:rPr>
-          <w:rFonts w:ascii="Times New Roman" w:hAnsi="Times New Roman" w:cs="Times New Roman"/>
-          <w:color w:val="0D0D0D" w:themeColor="text1" w:themeTint="F2"/>
-          <w:sz w:val="24"/>
-          <w:szCs w:val="24"/>
-        </w:rPr>
-        <w:t>.</w:t>
+        <w:t>Prasyarat: Admin telah login dan meja tersedia.</w:t>
       </w:r>
     </w:p>
     <w:p>
@@ -31073,16 +29673,7 @@
           <w:sz w:val="24"/>
           <w:szCs w:val="24"/>
         </w:rPr>
-        <w:t>Hasil: Status meja sesuai pengaturan yang t</w:t>
-      </w:r>
-      <w:r>
-        <w:rPr>
-          <w:rFonts w:ascii="Times New Roman" w:hAnsi="Times New Roman" w:cs="Times New Roman"/>
-          <w:color w:val="0D0D0D" w:themeColor="text1" w:themeTint="F2"/>
-          <w:sz w:val="24"/>
-          <w:szCs w:val="24"/>
-        </w:rPr>
-        <w:t>ersimpan.</w:t>
+        <w:t>Hasil: Status meja sesuai pengaturan yang tersimpan.</w:t>
       </w:r>
     </w:p>
     <w:p>
@@ -31178,16 +29769,7 @@
           <w:sz w:val="24"/>
           <w:szCs w:val="24"/>
         </w:rPr>
-        <w:t>Alur utama: Admin memperbarui teks, informasi kontak,</w:t>
-      </w:r>
-      <w:r>
-        <w:rPr>
-          <w:rFonts w:ascii="Times New Roman" w:hAnsi="Times New Roman" w:cs="Times New Roman"/>
-          <w:color w:val="0D0D0D" w:themeColor="text1" w:themeTint="F2"/>
-          <w:sz w:val="24"/>
-          <w:szCs w:val="24"/>
-        </w:rPr>
-        <w:t xml:space="preserve"> atau pengaturan konten beranda yang tersedia; sistem menampilkan ringkasan perubahan sebelum atau sesudah disimpan.</w:t>
+        <w:t>Alur utama: Admin memperbarui teks, informasi kontak, atau pengaturan konten beranda yang tersedia; sistem menampilkan ringkasan perubahan sebelum atau sesudah disimpan.</w:t>
       </w:r>
     </w:p>
     <w:p>
@@ -31226,16 +29808,7 @@
           <w:sz w:val="24"/>
           <w:szCs w:val="24"/>
         </w:rPr>
-        <w:t>Hasil: Inf</w:t>
-      </w:r>
-      <w:r>
-        <w:rPr>
-          <w:rFonts w:ascii="Times New Roman" w:hAnsi="Times New Roman" w:cs="Times New Roman"/>
-          <w:color w:val="0D0D0D" w:themeColor="text1" w:themeTint="F2"/>
-          <w:sz w:val="24"/>
-          <w:szCs w:val="24"/>
-        </w:rPr>
-        <w:t>ormasi publik mengikuti pengaturan yang tersimpan.</w:t>
+        <w:t>Hasil: Informasi publik mengikuti pengaturan yang tersimpan.</w:t>
       </w:r>
     </w:p>
     <w:p>
@@ -31331,16 +29904,7 @@
           <w:sz w:val="24"/>
           <w:szCs w:val="24"/>
         </w:rPr>
-        <w:t>Alur utama: Admin memilih keluar; sistem mengakhiri sesi dan men</w:t>
-      </w:r>
-      <w:r>
-        <w:rPr>
-          <w:rFonts w:ascii="Times New Roman" w:hAnsi="Times New Roman" w:cs="Times New Roman"/>
-          <w:color w:val="0D0D0D" w:themeColor="text1" w:themeTint="F2"/>
-          <w:sz w:val="24"/>
-          <w:szCs w:val="24"/>
-        </w:rPr>
-        <w:t>ampilkan area masuk atau halaman publik.</w:t>
+        <w:t>Alur utama: Admin memilih keluar; sistem mengakhiri sesi dan menampilkan area masuk atau halaman publik.</w:t>
       </w:r>
     </w:p>
     <w:p>
@@ -32731,16 +31295,7 @@
                 <w:sz w:val="24"/>
                 <w:szCs w:val="24"/>
               </w:rPr>
-              <w:t>Admin dapat melihat dan</w:t>
-            </w:r>
-            <w:r>
-              <w:rPr>
-                <w:rFonts w:ascii="Times New Roman" w:hAnsi="Times New Roman" w:cs="Times New Roman"/>
-                <w:color w:val="0D0D0D" w:themeColor="text1" w:themeTint="F2"/>
-                <w:sz w:val="24"/>
-                <w:szCs w:val="24"/>
-              </w:rPr>
-              <w:t xml:space="preserve"> memperbarui status pesanan</w:t>
+              <w:t>Admin dapat melihat dan memperbarui status pesanan</w:t>
             </w:r>
           </w:p>
         </w:tc>
@@ -33260,16 +31815,7 @@
                 <w:sz w:val="24"/>
                 <w:szCs w:val="24"/>
               </w:rPr>
-              <w:t xml:space="preserve">Admin dapat melihat </w:t>
-            </w:r>
-            <w:r>
-              <w:rPr>
-                <w:rFonts w:ascii="Times New Roman" w:hAnsi="Times New Roman" w:cs="Times New Roman"/>
-                <w:color w:val="0D0D0D" w:themeColor="text1" w:themeTint="F2"/>
-                <w:sz w:val="24"/>
-                <w:szCs w:val="24"/>
-              </w:rPr>
-              <w:t>ringkasan statistik</w:t>
+              <w:t>Admin dapat melihat ringkasan statistik</w:t>
             </w:r>
           </w:p>
         </w:tc>
@@ -33321,16 +31867,7 @@
           <w:sz w:val="24"/>
           <w:szCs w:val="24"/>
         </w:rPr>
-        <w:t>Batas dokumentasi: User Story dan Use Case hanya menjelaskan kebutuhan/tujuan aktor serta respons sistem yang terlihat. Pekerjaan seperti membuat komponen Svelte, endpoint Express, vali</w:t>
-      </w:r>
-      <w:r>
-        <w:rPr>
-          <w:rFonts w:ascii="Times New Roman" w:hAnsi="Times New Roman" w:cs="Times New Roman"/>
-          <w:color w:val="0D0D0D" w:themeColor="text1" w:themeTint="F2"/>
-          <w:sz w:val="24"/>
-          <w:szCs w:val="24"/>
-        </w:rPr>
-        <w:t>dasi Zod, token JWT, skema SQLite, upload Multer, dan integrasi API merupakan task implementasi yang dicatat terpisah pada Sprint Backlog. Frontend dan backend bukan aktor, bukan peran pengguna, dan bukan user story.</w:t>
+        <w:t>Batas dokumentasi: User Story dan Use Case hanya menjelaskan kebutuhan/tujuan aktor serta respons sistem yang terlihat. Pekerjaan seperti membuat komponen Svelte, endpoint Express, validasi Zod, token JWT, skema SQLite, upload Multer, dan integrasi API merupakan task implementasi yang dicatat terpisah pada Sprint Backlog. Frontend dan backend bukan aktor, bukan peran pengguna, dan bukan user story.</w:t>
       </w:r>
     </w:p>
     <w:tbl>
@@ -34402,16 +32939,7 @@
                 <w:sz w:val="24"/>
                 <w:szCs w:val="24"/>
               </w:rPr>
-              <w:t xml:space="preserve">Tim </w:t>
-            </w:r>
-            <w:r>
-              <w:rPr>
-                <w:rFonts w:ascii="Times New Roman" w:hAnsi="Times New Roman" w:cs="Times New Roman"/>
-                <w:color w:val="0D0D0D" w:themeColor="text1" w:themeTint="F2"/>
-                <w:sz w:val="24"/>
-                <w:szCs w:val="24"/>
-              </w:rPr>
-              <w:t>backend/QA</w:t>
+              <w:t>Tim backend/QA</w:t>
             </w:r>
           </w:p>
         </w:tc>
@@ -35308,16 +33836,7 @@
           <w:sz w:val="24"/>
           <w:szCs w:val="24"/>
         </w:rPr>
-        <w:t>Skenario berikut diturunkan dari k</w:t>
-      </w:r>
-      <w:r>
-        <w:rPr>
-          <w:rFonts w:ascii="Times New Roman" w:hAnsi="Times New Roman" w:cs="Times New Roman"/>
-          <w:color w:val="0D0D0D" w:themeColor="text1" w:themeTint="F2"/>
-          <w:sz w:val="24"/>
-          <w:szCs w:val="24"/>
-        </w:rPr>
-        <w:t>ebutuhan dan use case LYCO. Kolom hasil aktual sengaja kosong karena pengujian belum dibuktikan dalam sumber yang tersedia.</w:t>
+        <w:t>Skenario berikut diturunkan dari kebutuhan dan use case LYCO. Kolom hasil aktual sengaja kosong karena pengujian belum dibuktikan dalam sumber yang tersedia.</w:t>
       </w:r>
     </w:p>
     <w:tbl>
@@ -35549,16 +34068,7 @@
                 <w:sz w:val="24"/>
                 <w:szCs w:val="24"/>
               </w:rPr>
-              <w:t xml:space="preserve">Buka katalog saat </w:t>
-            </w:r>
-            <w:r>
-              <w:rPr>
-                <w:rFonts w:ascii="Times New Roman" w:hAnsi="Times New Roman" w:cs="Times New Roman"/>
-                <w:color w:val="0D0D0D" w:themeColor="text1" w:themeTint="F2"/>
-                <w:sz w:val="24"/>
-                <w:szCs w:val="24"/>
-              </w:rPr>
-              <w:t>data produk tersedia.</w:t>
+              <w:t>Buka katalog saat data produk tersedia.</w:t>
             </w:r>
           </w:p>
         </w:tc>
@@ -35832,16 +34342,7 @@
                 <w:sz w:val="24"/>
                 <w:szCs w:val="24"/>
               </w:rPr>
-              <w:t>Masukkan kata kunci yang tid</w:t>
-            </w:r>
-            <w:r>
-              <w:rPr>
-                <w:rFonts w:ascii="Times New Roman" w:hAnsi="Times New Roman" w:cs="Times New Roman"/>
-                <w:color w:val="0D0D0D" w:themeColor="text1" w:themeTint="F2"/>
-                <w:sz w:val="24"/>
-                <w:szCs w:val="24"/>
-              </w:rPr>
-              <w:t>ak cocok.</w:t>
+              <w:t>Masukkan kata kunci yang tidak cocok.</w:t>
             </w:r>
           </w:p>
         </w:tc>
@@ -36139,16 +34640,7 @@
                 <w:sz w:val="24"/>
                 <w:szCs w:val="24"/>
               </w:rPr>
-              <w:t>Jumlah</w:t>
-            </w:r>
-            <w:r>
-              <w:rPr>
-                <w:rFonts w:ascii="Times New Roman" w:hAnsi="Times New Roman" w:cs="Times New Roman"/>
-                <w:color w:val="0D0D0D" w:themeColor="text1" w:themeTint="F2"/>
-                <w:sz w:val="24"/>
-                <w:szCs w:val="24"/>
-              </w:rPr>
-              <w:t xml:space="preserve"> dan total biaya diperbarui benar.</w:t>
+              <w:t>Jumlah dan total biaya diperbarui benar.</w:t>
             </w:r>
           </w:p>
         </w:tc>
@@ -36398,16 +34890,7 @@
                 <w:sz w:val="24"/>
                 <w:szCs w:val="24"/>
               </w:rPr>
-              <w:t xml:space="preserve">Isi data wajib, pilih item, lalu kirim </w:t>
-            </w:r>
-            <w:r>
-              <w:rPr>
-                <w:rFonts w:ascii="Times New Roman" w:hAnsi="Times New Roman" w:cs="Times New Roman"/>
-                <w:color w:val="0D0D0D" w:themeColor="text1" w:themeTint="F2"/>
-                <w:sz w:val="24"/>
-                <w:szCs w:val="24"/>
-              </w:rPr>
-              <w:t>pesanan.</w:t>
+              <w:t>Isi data wajib, pilih item, lalu kirim pesanan.</w:t>
             </w:r>
           </w:p>
         </w:tc>
@@ -36706,16 +35189,7 @@
                 <w:sz w:val="24"/>
                 <w:szCs w:val="24"/>
               </w:rPr>
-              <w:t xml:space="preserve">Akses ditolak dan </w:t>
-            </w:r>
-            <w:r>
-              <w:rPr>
-                <w:rFonts w:ascii="Times New Roman" w:hAnsi="Times New Roman" w:cs="Times New Roman"/>
-                <w:color w:val="0D0D0D" w:themeColor="text1" w:themeTint="F2"/>
-                <w:sz w:val="24"/>
-                <w:szCs w:val="24"/>
-              </w:rPr>
-              <w:t>pesan yang sesuai ditampilkan.</w:t>
+              <w:t>Akses ditolak dan pesan yang sesuai ditampilkan.</w:t>
             </w:r>
           </w:p>
         </w:tc>
@@ -36989,16 +35463,7 @@
                 <w:sz w:val="24"/>
                 <w:szCs w:val="24"/>
               </w:rPr>
-              <w:t xml:space="preserve">Sistem menolak duplikasi dan </w:t>
-            </w:r>
-            <w:r>
-              <w:rPr>
-                <w:rFonts w:ascii="Times New Roman" w:hAnsi="Times New Roman" w:cs="Times New Roman"/>
-                <w:color w:val="0D0D0D" w:themeColor="text1" w:themeTint="F2"/>
-                <w:sz w:val="24"/>
-                <w:szCs w:val="24"/>
-              </w:rPr>
-              <w:t>memberi informasi.</w:t>
+              <w:t>Sistem menolak duplikasi dan memberi informasi.</w:t>
             </w:r>
           </w:p>
         </w:tc>
@@ -37311,16 +35776,7 @@
                 <w:sz w:val="24"/>
                 <w:szCs w:val="24"/>
               </w:rPr>
-              <w:t>B</w:t>
-            </w:r>
-            <w:r>
-              <w:rPr>
-                <w:rFonts w:ascii="Times New Roman" w:hAnsi="Times New Roman" w:cs="Times New Roman"/>
-                <w:color w:val="0D0D0D" w:themeColor="text1" w:themeTint="F2"/>
-                <w:sz w:val="24"/>
-                <w:szCs w:val="24"/>
-              </w:rPr>
-              <w:t>elum diuji</w:t>
+              <w:t>Belum diuji</w:t>
             </w:r>
           </w:p>
         </w:tc>
@@ -50874,7 +49330,7 @@
 </file>
 
 <file path=customXml/itemProps1.xml><?xml version="1.0" encoding="utf-8"?>
-<ds:datastoreItem xmlns:ds="http://schemas.openxmlformats.org/officeDocument/2006/customXml" ds:itemID="{DC39D40A-3ACE-4F1D-AA42-A91AE5A7CF57}">
+<ds:datastoreItem xmlns:ds="http://schemas.openxmlformats.org/officeDocument/2006/customXml" ds:itemID="{D7BE9149-4DD6-4288-840C-75398626A47B}">
   <ds:schemaRefs>
     <ds:schemaRef ds:uri="http://schemas.openxmlformats.org/officeDocument/2006/bibliography"/>
   </ds:schemaRefs>

</xml_diff>